<commit_message>
feat: db ver 1
</commit_message>
<xml_diff>
--- a/doc/Xedien.docx
+++ b/doc/Xedien.docx
@@ -27,16 +27,16 @@
         <w:rPr>
           <w:b/>
           <w:bCs/>
-          <w:sz w:val="24"/>
-          <w:szCs w:val="24"/>
-        </w:rPr>
-      </w:pPr>
-      <w:r>
-        <w:rPr>
-          <w:b/>
-          <w:bCs/>
-          <w:sz w:val="24"/>
-          <w:szCs w:val="24"/>
+          <w:sz w:val="34"/>
+          <w:szCs w:val="34"/>
+        </w:rPr>
+      </w:pPr>
+      <w:r>
+        <w:rPr>
+          <w:b/>
+          <w:bCs/>
+          <w:sz w:val="34"/>
+          <w:szCs w:val="34"/>
         </w:rPr>
         <w:t>1, Mô tả đề bài</w:t>
       </w:r>
@@ -46,6 +46,7 @@
         <w:rPr>
           <w:sz w:val="24"/>
           <w:szCs w:val="24"/>
+          <w:lang w:val="vi-VN"/>
         </w:rPr>
       </w:pPr>
       <w:r>
@@ -59,8 +60,39 @@
     <w:p>
       <w:pPr>
         <w:rPr>
-          <w:sz w:val="24"/>
-          <w:szCs w:val="24"/>
+          <w:b/>
+          <w:bCs/>
+          <w:sz w:val="24"/>
+          <w:szCs w:val="24"/>
+          <w:lang w:val="vi-VN"/>
+        </w:rPr>
+      </w:pPr>
+      <w:r>
+        <w:rPr>
+          <w:b/>
+          <w:bCs/>
+          <w:sz w:val="24"/>
+          <w:szCs w:val="24"/>
+        </w:rPr>
+        <w:t>1.1</w:t>
+      </w:r>
+      <w:r>
+        <w:rPr>
+          <w:b/>
+          <w:bCs/>
+          <w:sz w:val="24"/>
+          <w:szCs w:val="24"/>
+          <w:lang w:val="vi-VN"/>
+        </w:rPr>
+        <w:t>, Khách hàng</w:t>
+      </w:r>
+    </w:p>
+    <w:p>
+      <w:pPr>
+        <w:rPr>
+          <w:sz w:val="24"/>
+          <w:szCs w:val="24"/>
+          <w:lang w:val="vi-VN"/>
         </w:rPr>
       </w:pPr>
       <w:r>
@@ -77,10 +109,45 @@
         </w:rPr>
         <w:t xml:space="preserve">có tài khoản riêng (name, email, password, phone) </w:t>
       </w:r>
-      <w:r>
-        <w:rPr>
-          <w:sz w:val="24"/>
-          <w:szCs w:val="24"/>
+    </w:p>
+    <w:p>
+      <w:pPr>
+        <w:rPr>
+          <w:sz w:val="24"/>
+          <w:szCs w:val="24"/>
+          <w:lang w:val="vi-VN"/>
+        </w:rPr>
+      </w:pPr>
+      <w:r>
+        <w:rPr>
+          <w:sz w:val="24"/>
+          <w:szCs w:val="24"/>
+          <w:lang w:val="vi-VN"/>
+        </w:rPr>
+        <w:t>Khách hàng có thể tìm kiếm đặt xe theo thời gian (ngày nhận xe, ngày trả xe), và địa điểm</w:t>
+      </w:r>
+    </w:p>
+    <w:p>
+      <w:pPr>
+        <w:rPr>
+          <w:sz w:val="24"/>
+          <w:szCs w:val="24"/>
+          <w:lang w:val="vi-VN"/>
+        </w:rPr>
+      </w:pPr>
+      <w:r>
+        <w:rPr>
+          <w:sz w:val="24"/>
+          <w:szCs w:val="24"/>
+          <w:lang w:val="vi-VN"/>
+        </w:rPr>
+        <w:t xml:space="preserve">Ngoài ra, </w:t>
+      </w:r>
+      <w:r>
+        <w:rPr>
+          <w:sz w:val="24"/>
+          <w:szCs w:val="24"/>
+          <w:lang w:val="vi-VN"/>
         </w:rPr>
         <w:t xml:space="preserve">có thể check nhiều loài xe điện khác nhau, xem các thông số như: </w:t>
       </w:r>
@@ -95,19 +162,38 @@
         <w:rPr>
           <w:sz w:val="24"/>
           <w:szCs w:val="24"/>
-        </w:rPr>
-      </w:pPr>
-      <w:r>
-        <w:rPr>
-          <w:sz w:val="24"/>
-          <w:szCs w:val="24"/>
-        </w:rPr>
-        <w:t>H</w:t>
-      </w:r>
-      <w:r>
-        <w:rPr>
-          <w:sz w:val="24"/>
-          <w:szCs w:val="24"/>
+          <w:lang w:val="vi-VN"/>
+        </w:rPr>
+      </w:pPr>
+      <w:r>
+        <w:rPr>
+          <w:sz w:val="24"/>
+          <w:szCs w:val="24"/>
+          <w:lang w:val="vi-VN"/>
+        </w:rPr>
+        <w:t>Xem</w:t>
+      </w:r>
+      <w:r>
+        <w:rPr>
+          <w:sz w:val="24"/>
+          <w:szCs w:val="24"/>
+          <w:lang w:val="vi-VN"/>
+        </w:rPr>
+        <w:t xml:space="preserve"> </w:t>
+      </w:r>
+      <w:r>
+        <w:rPr>
+          <w:sz w:val="24"/>
+          <w:szCs w:val="24"/>
+          <w:lang w:val="vi-VN"/>
+        </w:rPr>
+        <w:t>h</w:t>
+      </w:r>
+      <w:r>
+        <w:rPr>
+          <w:sz w:val="24"/>
+          <w:szCs w:val="24"/>
+          <w:lang w:val="vi-VN"/>
         </w:rPr>
         <w:t xml:space="preserve">ãng xe (tên, brand, số ghế, </w:t>
       </w:r>
@@ -115,6 +201,7 @@
         <w:rPr>
           <w:sz w:val="24"/>
           <w:szCs w:val="24"/>
+          <w:lang w:val="vi-VN"/>
         </w:rPr>
         <w:t xml:space="preserve">mã lực, </w:t>
       </w:r>
@@ -122,6 +209,7 @@
         <w:rPr>
           <w:sz w:val="24"/>
           <w:szCs w:val="24"/>
+          <w:lang w:val="vi-VN"/>
         </w:rPr>
         <w:t>giới hạn pin, giới hạn km</w:t>
       </w:r>
@@ -129,6 +217,7 @@
         <w:rPr>
           <w:sz w:val="24"/>
           <w:szCs w:val="24"/>
+          <w:lang w:val="vi-VN"/>
         </w:rPr>
         <w:t>, phân khúc xe, trunk-capacity-sức chứa cốp xe, transmission-hộp số của xe, số túi khí</w:t>
       </w:r>
@@ -136,6 +225,7 @@
         <w:rPr>
           <w:sz w:val="24"/>
           <w:szCs w:val="24"/>
+          <w:lang w:val="vi-VN"/>
         </w:rPr>
         <w:t>)</w:t>
       </w:r>
@@ -143,6 +233,7 @@
         <w:rPr>
           <w:sz w:val="24"/>
           <w:szCs w:val="24"/>
+          <w:lang w:val="vi-VN"/>
         </w:rPr>
         <w:t xml:space="preserve">. </w:t>
       </w:r>
@@ -157,15 +248,1400 @@
         <w:rPr>
           <w:sz w:val="24"/>
           <w:szCs w:val="24"/>
-        </w:rPr>
-      </w:pPr>
-      <w:r>
-        <w:rPr>
-          <w:sz w:val="24"/>
-          <w:szCs w:val="24"/>
-        </w:rPr>
-        <w:t>Gía cả (tùy thuộc vào rental-plan và hãng xe)</w:t>
-      </w:r>
+          <w:lang w:val="vi-VN"/>
+        </w:rPr>
+      </w:pPr>
+      <w:r>
+        <w:rPr>
+          <w:sz w:val="24"/>
+          <w:szCs w:val="24"/>
+          <w:lang w:val="vi-VN"/>
+        </w:rPr>
+        <w:t xml:space="preserve">Đọc mô tả, đặc điểm, đánh giá. </w:t>
+      </w:r>
+    </w:p>
+    <w:p>
+      <w:pPr>
+        <w:pStyle w:val="oancuaDanhsach"/>
+        <w:numPr>
+          <w:ilvl w:val="0"/>
+          <w:numId w:val="1"/>
+        </w:numPr>
+        <w:rPr>
+          <w:sz w:val="24"/>
+          <w:szCs w:val="24"/>
+          <w:lang w:val="vi-VN"/>
+        </w:rPr>
+      </w:pPr>
+      <w:r>
+        <w:rPr>
+          <w:sz w:val="24"/>
+          <w:szCs w:val="24"/>
+          <w:lang w:val="vi-VN"/>
+        </w:rPr>
+        <w:t>Xem giá</w:t>
+      </w:r>
+      <w:r>
+        <w:rPr>
+          <w:sz w:val="24"/>
+          <w:szCs w:val="24"/>
+          <w:lang w:val="vi-VN"/>
+        </w:rPr>
+        <w:t xml:space="preserve"> cả (tùy thuộc vào rental-plan </w:t>
+      </w:r>
+      <w:r>
+        <w:rPr>
+          <w:sz w:val="24"/>
+          <w:szCs w:val="24"/>
+          <w:lang w:val="vi-VN"/>
+        </w:rPr>
+        <w:t xml:space="preserve">(theo ngày, tháng, năm) </w:t>
+      </w:r>
+      <w:r>
+        <w:rPr>
+          <w:sz w:val="24"/>
+          <w:szCs w:val="24"/>
+          <w:lang w:val="vi-VN"/>
+        </w:rPr>
+        <w:t>và hãng xe)</w:t>
+      </w:r>
+    </w:p>
+    <w:p>
+      <w:pPr>
+        <w:pStyle w:val="oancuaDanhsach"/>
+        <w:numPr>
+          <w:ilvl w:val="0"/>
+          <w:numId w:val="1"/>
+        </w:numPr>
+        <w:rPr>
+          <w:sz w:val="24"/>
+          <w:szCs w:val="24"/>
+        </w:rPr>
+      </w:pPr>
+      <w:r>
+        <w:rPr>
+          <w:sz w:val="24"/>
+          <w:szCs w:val="24"/>
+          <w:lang w:val="vi-VN"/>
+        </w:rPr>
+        <w:t>Xem ảnh các xe</w:t>
+      </w:r>
+    </w:p>
+    <w:p>
+      <w:pPr>
+        <w:pStyle w:val="oancuaDanhsach"/>
+        <w:numPr>
+          <w:ilvl w:val="0"/>
+          <w:numId w:val="1"/>
+        </w:numPr>
+        <w:rPr>
+          <w:sz w:val="24"/>
+          <w:szCs w:val="24"/>
+        </w:rPr>
+      </w:pPr>
+      <w:r>
+        <w:rPr>
+          <w:sz w:val="24"/>
+          <w:szCs w:val="24"/>
+        </w:rPr>
+        <w:t>Nếu ưng có thể bắt đầu thực hiện booking</w:t>
+      </w:r>
+    </w:p>
+    <w:p>
+      <w:pPr>
+        <w:pStyle w:val="oancuaDanhsach"/>
+        <w:numPr>
+          <w:ilvl w:val="0"/>
+          <w:numId w:val="1"/>
+        </w:numPr>
+        <w:rPr>
+          <w:sz w:val="24"/>
+          <w:szCs w:val="24"/>
+        </w:rPr>
+      </w:pPr>
+      <w:r>
+        <w:rPr>
+          <w:sz w:val="24"/>
+          <w:szCs w:val="24"/>
+        </w:rPr>
+        <w:t>Nếu còn thắc mắc có thể chọn “tư vấn thêm”</w:t>
+      </w:r>
+    </w:p>
+    <w:p>
+      <w:pPr>
+        <w:rPr>
+          <w:sz w:val="24"/>
+          <w:szCs w:val="24"/>
+        </w:rPr>
+      </w:pPr>
+      <w:r>
+        <w:rPr>
+          <w:sz w:val="24"/>
+          <w:szCs w:val="24"/>
+        </w:rPr>
+        <w:t xml:space="preserve">Booking: khách hàng </w:t>
+      </w:r>
+      <w:r>
+        <w:rPr>
+          <w:sz w:val="24"/>
+          <w:szCs w:val="24"/>
+        </w:rPr>
+        <w:t xml:space="preserve">chọn xe mình muốn thuê, nhập thông tin cá nhân (phone, email) để liên hệ, sau đó thực hiện thanh toán. </w:t>
+      </w:r>
+    </w:p>
+    <w:p>
+      <w:pPr>
+        <w:rPr>
+          <w:sz w:val="24"/>
+          <w:szCs w:val="24"/>
+        </w:rPr>
+      </w:pPr>
+      <w:r>
+        <w:rPr>
+          <w:sz w:val="24"/>
+          <w:szCs w:val="24"/>
+        </w:rPr>
+        <w:t>Payment: chọn ngân hàng, nhập tiền, thanh toán</w:t>
+      </w:r>
+    </w:p>
+    <w:p>
+      <w:pPr>
+        <w:rPr>
+          <w:sz w:val="24"/>
+          <w:szCs w:val="24"/>
+        </w:rPr>
+      </w:pPr>
+      <w:r>
+        <w:rPr>
+          <w:sz w:val="24"/>
+          <w:szCs w:val="24"/>
+        </w:rPr>
+        <w:t>Nhận xe thế nào? (Có 1 mã j đó…</w:t>
+      </w:r>
+      <w:r>
+        <w:rPr>
+          <w:sz w:val="24"/>
+          <w:szCs w:val="24"/>
+        </w:rPr>
+        <w:t xml:space="preserve"> tính sau) </w:t>
+      </w:r>
+    </w:p>
+    <w:p>
+      <w:pPr>
+        <w:rPr>
+          <w:sz w:val="24"/>
+          <w:szCs w:val="24"/>
+        </w:rPr>
+      </w:pPr>
+      <w:r>
+        <w:rPr>
+          <w:sz w:val="24"/>
+          <w:szCs w:val="24"/>
+        </w:rPr>
+        <w:t xml:space="preserve">Trả xe: nếu quá giờ, quá km </w:t>
+      </w:r>
+      <w:r>
+        <w:rPr>
+          <w:sz w:val="24"/>
+          <w:szCs w:val="24"/>
+        </w:rPr>
+        <w:sym w:font="Wingdings" w:char="F0E0"/>
+      </w:r>
+      <w:r>
+        <w:rPr>
+          <w:sz w:val="24"/>
+          <w:szCs w:val="24"/>
+        </w:rPr>
+        <w:t xml:space="preserve"> Chịu thêm phí phát sinh</w:t>
+      </w:r>
+    </w:p>
+    <w:p>
+      <w:pPr>
+        <w:rPr>
+          <w:sz w:val="24"/>
+          <w:szCs w:val="24"/>
+        </w:rPr>
+      </w:pPr>
+    </w:p>
+    <w:p>
+      <w:pPr>
+        <w:rPr>
+          <w:sz w:val="24"/>
+          <w:szCs w:val="24"/>
+        </w:rPr>
+      </w:pPr>
+      <w:r>
+        <w:rPr>
+          <w:sz w:val="24"/>
+          <w:szCs w:val="24"/>
+        </w:rPr>
+        <w:t>Có thể đăng thông tin cho thuê xe?</w:t>
+      </w:r>
+    </w:p>
+    <w:p>
+      <w:pPr>
+        <w:rPr>
+          <w:sz w:val="24"/>
+          <w:szCs w:val="24"/>
+        </w:rPr>
+      </w:pPr>
+    </w:p>
+    <w:p>
+      <w:pPr>
+        <w:rPr>
+          <w:b/>
+          <w:bCs/>
+          <w:sz w:val="24"/>
+          <w:szCs w:val="24"/>
+        </w:rPr>
+      </w:pPr>
+      <w:r>
+        <w:rPr>
+          <w:b/>
+          <w:bCs/>
+          <w:sz w:val="24"/>
+          <w:szCs w:val="24"/>
+        </w:rPr>
+        <w:t>1.2</w:t>
+      </w:r>
+      <w:r>
+        <w:rPr>
+          <w:b/>
+          <w:bCs/>
+          <w:sz w:val="24"/>
+          <w:szCs w:val="24"/>
+        </w:rPr>
+        <w:t xml:space="preserve">, </w:t>
+      </w:r>
+      <w:r>
+        <w:rPr>
+          <w:b/>
+          <w:bCs/>
+          <w:sz w:val="24"/>
+          <w:szCs w:val="24"/>
+        </w:rPr>
+        <w:t>Admin</w:t>
+      </w:r>
+    </w:p>
+    <w:p>
+      <w:pPr>
+        <w:rPr>
+          <w:sz w:val="24"/>
+          <w:szCs w:val="24"/>
+        </w:rPr>
+      </w:pPr>
+      <w:r>
+        <w:rPr>
+          <w:sz w:val="24"/>
+          <w:szCs w:val="24"/>
+        </w:rPr>
+        <w:t>Đăng các thông tin về xe</w:t>
+      </w:r>
+      <w:r>
+        <w:rPr>
+          <w:sz w:val="24"/>
+          <w:szCs w:val="24"/>
+        </w:rPr>
+        <w:t xml:space="preserve"> cộ, giá cả, news, vv</w:t>
+      </w:r>
+      <w:r>
+        <w:rPr>
+          <w:sz w:val="24"/>
+          <w:szCs w:val="24"/>
+        </w:rPr>
+        <w:t xml:space="preserve">  </w:t>
+      </w:r>
+      <w:r>
+        <w:rPr>
+          <w:sz w:val="24"/>
+          <w:szCs w:val="24"/>
+        </w:rPr>
+        <w:t xml:space="preserve"> </w:t>
+      </w:r>
+    </w:p>
+    <w:p>
+      <w:pPr>
+        <w:rPr>
+          <w:sz w:val="24"/>
+          <w:szCs w:val="24"/>
+        </w:rPr>
+      </w:pPr>
+      <w:r>
+        <w:rPr>
+          <w:sz w:val="24"/>
+          <w:szCs w:val="24"/>
+        </w:rPr>
+        <w:t>Quản lý doanh thu vv</w:t>
+      </w:r>
+    </w:p>
+    <w:p>
+      <w:pPr>
+        <w:rPr>
+          <w:sz w:val="24"/>
+          <w:szCs w:val="24"/>
+        </w:rPr>
+      </w:pPr>
+      <w:r>
+        <w:rPr>
+          <w:sz w:val="24"/>
+          <w:szCs w:val="24"/>
+        </w:rPr>
+        <w:t xml:space="preserve">Quản lý xe </w:t>
+      </w:r>
+    </w:p>
+    <w:p>
+      <w:pPr>
+        <w:rPr>
+          <w:sz w:val="24"/>
+          <w:szCs w:val="24"/>
+        </w:rPr>
+      </w:pPr>
+      <w:r>
+        <w:rPr>
+          <w:sz w:val="24"/>
+          <w:szCs w:val="24"/>
+        </w:rPr>
+        <w:t>Quản lý bài đăng</w:t>
+      </w:r>
+    </w:p>
+    <w:p>
+      <w:pPr>
+        <w:rPr>
+          <w:sz w:val="24"/>
+          <w:szCs w:val="24"/>
+        </w:rPr>
+      </w:pPr>
+    </w:p>
+    <w:p>
+      <w:pPr>
+        <w:rPr>
+          <w:b/>
+          <w:bCs/>
+          <w:sz w:val="24"/>
+          <w:szCs w:val="24"/>
+        </w:rPr>
+      </w:pPr>
+      <w:r>
+        <w:rPr>
+          <w:b/>
+          <w:bCs/>
+          <w:sz w:val="34"/>
+          <w:szCs w:val="34"/>
+        </w:rPr>
+        <w:lastRenderedPageBreak/>
+        <w:t>2, Luồng nghiệp vụ</w:t>
+      </w:r>
+      <w:r>
+        <w:rPr>
+          <w:b/>
+          <w:bCs/>
+          <w:sz w:val="24"/>
+          <w:szCs w:val="24"/>
+        </w:rPr>
+        <w:t xml:space="preserve"> </w:t>
+      </w:r>
+      <w:r>
+        <w:rPr>
+          <w:b/>
+          <w:bCs/>
+          <w:sz w:val="24"/>
+          <w:szCs w:val="24"/>
+        </w:rPr>
+        <w:br/>
+        <w:t>2.</w:t>
+      </w:r>
+      <w:r>
+        <w:rPr>
+          <w:b/>
+          <w:bCs/>
+          <w:sz w:val="24"/>
+          <w:szCs w:val="24"/>
+        </w:rPr>
+        <w:t>1</w:t>
+      </w:r>
+      <w:r>
+        <w:rPr>
+          <w:b/>
+          <w:bCs/>
+          <w:sz w:val="24"/>
+          <w:szCs w:val="24"/>
+        </w:rPr>
+        <w:t xml:space="preserve">, </w:t>
+      </w:r>
+      <w:r>
+        <w:rPr>
+          <w:b/>
+          <w:bCs/>
+          <w:sz w:val="24"/>
+          <w:szCs w:val="24"/>
+        </w:rPr>
+        <w:t>Tìm kiếm &amp; Đặt xe (Booking)</w:t>
+      </w:r>
+    </w:p>
+    <w:p>
+      <w:pPr>
+        <w:rPr>
+          <w:sz w:val="24"/>
+          <w:szCs w:val="24"/>
+        </w:rPr>
+      </w:pPr>
+      <w:r>
+        <w:rPr>
+          <w:sz w:val="24"/>
+          <w:szCs w:val="24"/>
+        </w:rPr>
+        <w:t>Đây là bước khách hàng tương tác với hệ thống để giữ xe.</w:t>
+      </w:r>
+    </w:p>
+    <w:p>
+      <w:pPr>
+        <w:numPr>
+          <w:ilvl w:val="0"/>
+          <w:numId w:val="2"/>
+        </w:numPr>
+        <w:rPr>
+          <w:sz w:val="24"/>
+          <w:szCs w:val="24"/>
+        </w:rPr>
+      </w:pPr>
+      <w:r>
+        <w:rPr>
+          <w:b/>
+          <w:bCs/>
+          <w:sz w:val="24"/>
+          <w:szCs w:val="24"/>
+        </w:rPr>
+        <w:t>Tìm kiếm:</w:t>
+      </w:r>
+      <w:r>
+        <w:rPr>
+          <w:sz w:val="24"/>
+          <w:szCs w:val="24"/>
+        </w:rPr>
+        <w:t xml:space="preserve"> Khách nhập start_time, end_time và location_id.</w:t>
+      </w:r>
+    </w:p>
+    <w:p>
+      <w:pPr>
+        <w:numPr>
+          <w:ilvl w:val="1"/>
+          <w:numId w:val="2"/>
+        </w:numPr>
+        <w:rPr>
+          <w:sz w:val="24"/>
+          <w:szCs w:val="24"/>
+        </w:rPr>
+      </w:pPr>
+      <w:r>
+        <w:rPr>
+          <w:b/>
+          <w:bCs/>
+          <w:sz w:val="24"/>
+          <w:szCs w:val="24"/>
+        </w:rPr>
+        <w:t>Logic:</w:t>
+      </w:r>
+      <w:r>
+        <w:rPr>
+          <w:sz w:val="24"/>
+          <w:szCs w:val="24"/>
+        </w:rPr>
+        <w:t xml:space="preserve"> Hệ thống lọc trong bảng vehicles những xe có status = 'available'.</w:t>
+      </w:r>
+    </w:p>
+    <w:p>
+      <w:pPr>
+        <w:numPr>
+          <w:ilvl w:val="1"/>
+          <w:numId w:val="2"/>
+        </w:numPr>
+        <w:rPr>
+          <w:sz w:val="24"/>
+          <w:szCs w:val="24"/>
+        </w:rPr>
+      </w:pPr>
+      <w:r>
+        <w:rPr>
+          <w:b/>
+          <w:bCs/>
+          <w:sz w:val="24"/>
+          <w:szCs w:val="24"/>
+        </w:rPr>
+        <w:t>Quan trọng:</w:t>
+      </w:r>
+      <w:r>
+        <w:rPr>
+          <w:sz w:val="24"/>
+          <w:szCs w:val="24"/>
+        </w:rPr>
+        <w:t xml:space="preserve"> Hệ thống phải kiểm tra bảng bookings để loại trừ các xe đã có lịch đặt chồng chéo trong khoảng thời gian đó (mặc dù hiện tại nó đang available nhưng tương lai có thể đã bị đặt).</w:t>
+      </w:r>
+    </w:p>
+    <w:p>
+      <w:pPr>
+        <w:numPr>
+          <w:ilvl w:val="0"/>
+          <w:numId w:val="2"/>
+        </w:numPr>
+        <w:rPr>
+          <w:sz w:val="24"/>
+          <w:szCs w:val="24"/>
+        </w:rPr>
+      </w:pPr>
+      <w:r>
+        <w:rPr>
+          <w:b/>
+          <w:bCs/>
+          <w:sz w:val="24"/>
+          <w:szCs w:val="24"/>
+        </w:rPr>
+        <w:t>Chọn gói &amp; Xem giá:</w:t>
+      </w:r>
+      <w:r>
+        <w:rPr>
+          <w:sz w:val="24"/>
+          <w:szCs w:val="24"/>
+        </w:rPr>
+        <w:t xml:space="preserve"> Khách chọn mẫu xe (vehicle_model) và gói thuê (rental_plan).</w:t>
+      </w:r>
+    </w:p>
+    <w:p>
+      <w:pPr>
+        <w:numPr>
+          <w:ilvl w:val="1"/>
+          <w:numId w:val="2"/>
+        </w:numPr>
+        <w:rPr>
+          <w:sz w:val="24"/>
+          <w:szCs w:val="24"/>
+        </w:rPr>
+      </w:pPr>
+      <w:r>
+        <w:rPr>
+          <w:b/>
+          <w:bCs/>
+          <w:sz w:val="24"/>
+          <w:szCs w:val="24"/>
+        </w:rPr>
+        <w:t>Logic:</w:t>
+      </w:r>
+      <w:r>
+        <w:rPr>
+          <w:sz w:val="24"/>
+          <w:szCs w:val="24"/>
+        </w:rPr>
+        <w:t xml:space="preserve"> Truy vấn bảng pricing dựa trên vehicle_model_id và rental_plan_id để hiển thị giá dự kiến.</w:t>
+      </w:r>
+    </w:p>
+    <w:p>
+      <w:pPr>
+        <w:numPr>
+          <w:ilvl w:val="0"/>
+          <w:numId w:val="2"/>
+        </w:numPr>
+        <w:rPr>
+          <w:sz w:val="24"/>
+          <w:szCs w:val="24"/>
+        </w:rPr>
+      </w:pPr>
+      <w:r>
+        <w:rPr>
+          <w:b/>
+          <w:bCs/>
+          <w:sz w:val="24"/>
+          <w:szCs w:val="24"/>
+        </w:rPr>
+        <w:t>Tạo Booking:</w:t>
+      </w:r>
+      <w:r>
+        <w:rPr>
+          <w:sz w:val="24"/>
+          <w:szCs w:val="24"/>
+        </w:rPr>
+        <w:t xml:space="preserve"> Khi khách nhấn "Đặt xe", một bản ghi mới được tạo trong bảng bookings với status = 'pending'.</w:t>
+      </w:r>
+    </w:p>
+    <w:p>
+      <w:pPr>
+        <w:rPr>
+          <w:b/>
+          <w:bCs/>
+          <w:sz w:val="24"/>
+          <w:szCs w:val="24"/>
+        </w:rPr>
+      </w:pPr>
+      <w:r>
+        <w:rPr>
+          <w:b/>
+          <w:bCs/>
+          <w:sz w:val="24"/>
+          <w:szCs w:val="24"/>
+        </w:rPr>
+        <w:t>2.</w:t>
+      </w:r>
+      <w:r>
+        <w:rPr>
+          <w:b/>
+          <w:bCs/>
+          <w:sz w:val="24"/>
+          <w:szCs w:val="24"/>
+        </w:rPr>
+        <w:t>2,</w:t>
+      </w:r>
+      <w:r>
+        <w:rPr>
+          <w:b/>
+          <w:bCs/>
+          <w:sz w:val="24"/>
+          <w:szCs w:val="24"/>
+        </w:rPr>
+        <w:t xml:space="preserve"> Xác nhận &amp; Thanh toán cọc (Payment)</w:t>
+      </w:r>
+    </w:p>
+    <w:p>
+      <w:pPr>
+        <w:rPr>
+          <w:sz w:val="24"/>
+          <w:szCs w:val="24"/>
+        </w:rPr>
+      </w:pPr>
+      <w:r>
+        <w:rPr>
+          <w:sz w:val="24"/>
+          <w:szCs w:val="24"/>
+        </w:rPr>
+        <w:t>Để đảm bảo khách không "đặt ảo", quy trình thường yêu cầu đặt cọc.</w:t>
+      </w:r>
+    </w:p>
+    <w:p>
+      <w:pPr>
+        <w:numPr>
+          <w:ilvl w:val="0"/>
+          <w:numId w:val="3"/>
+        </w:numPr>
+        <w:rPr>
+          <w:sz w:val="24"/>
+          <w:szCs w:val="24"/>
+        </w:rPr>
+      </w:pPr>
+      <w:r>
+        <w:rPr>
+          <w:b/>
+          <w:bCs/>
+          <w:sz w:val="24"/>
+          <w:szCs w:val="24"/>
+        </w:rPr>
+        <w:t>Thanh toán:</w:t>
+      </w:r>
+      <w:r>
+        <w:rPr>
+          <w:sz w:val="24"/>
+          <w:szCs w:val="24"/>
+        </w:rPr>
+        <w:t xml:space="preserve"> Hệ thống tạo bản ghi trong bảng payments.</w:t>
+      </w:r>
+    </w:p>
+    <w:p>
+      <w:pPr>
+        <w:numPr>
+          <w:ilvl w:val="0"/>
+          <w:numId w:val="3"/>
+        </w:numPr>
+        <w:rPr>
+          <w:sz w:val="24"/>
+          <w:szCs w:val="24"/>
+        </w:rPr>
+      </w:pPr>
+      <w:r>
+        <w:rPr>
+          <w:b/>
+          <w:bCs/>
+          <w:sz w:val="24"/>
+          <w:szCs w:val="24"/>
+        </w:rPr>
+        <w:t>Xác nhận:</w:t>
+      </w:r>
+      <w:r>
+        <w:rPr>
+          <w:sz w:val="24"/>
+          <w:szCs w:val="24"/>
+        </w:rPr>
+        <w:t xml:space="preserve"> Sau khi payment_status = 'paid', trạng thái </w:t>
+      </w:r>
+      <w:proofErr w:type="gramStart"/>
+      <w:r>
+        <w:rPr>
+          <w:sz w:val="24"/>
+          <w:szCs w:val="24"/>
+        </w:rPr>
+        <w:t>bookings.status</w:t>
+      </w:r>
+      <w:proofErr w:type="gramEnd"/>
+      <w:r>
+        <w:rPr>
+          <w:sz w:val="24"/>
+          <w:szCs w:val="24"/>
+        </w:rPr>
+        <w:t xml:space="preserve"> chuyển thành 'confirmed'.</w:t>
+      </w:r>
+    </w:p>
+    <w:p>
+      <w:pPr>
+        <w:numPr>
+          <w:ilvl w:val="0"/>
+          <w:numId w:val="3"/>
+        </w:numPr>
+        <w:rPr>
+          <w:sz w:val="24"/>
+          <w:szCs w:val="24"/>
+        </w:rPr>
+      </w:pPr>
+      <w:r>
+        <w:rPr>
+          <w:b/>
+          <w:bCs/>
+          <w:sz w:val="24"/>
+          <w:szCs w:val="24"/>
+        </w:rPr>
+        <w:t>Giữ xe:</w:t>
+      </w:r>
+      <w:r>
+        <w:rPr>
+          <w:sz w:val="24"/>
+          <w:szCs w:val="24"/>
+        </w:rPr>
+        <w:t xml:space="preserve"> Lúc này, chiếc xe đó sẽ không hiển thị cho người khác đặt trong khoảng thời gian đã chọn.</w:t>
+      </w:r>
+    </w:p>
+    <w:p>
+      <w:pPr>
+        <w:rPr>
+          <w:b/>
+          <w:bCs/>
+          <w:sz w:val="24"/>
+          <w:szCs w:val="24"/>
+        </w:rPr>
+      </w:pPr>
+      <w:r>
+        <w:rPr>
+          <w:b/>
+          <w:bCs/>
+          <w:sz w:val="24"/>
+          <w:szCs w:val="24"/>
+        </w:rPr>
+        <w:t xml:space="preserve">2.3, </w:t>
+      </w:r>
+      <w:r>
+        <w:rPr>
+          <w:b/>
+          <w:bCs/>
+          <w:sz w:val="24"/>
+          <w:szCs w:val="24"/>
+        </w:rPr>
+        <w:t>Nhận xe (Pick-up)</w:t>
+      </w:r>
+    </w:p>
+    <w:p>
+      <w:pPr>
+        <w:rPr>
+          <w:sz w:val="24"/>
+          <w:szCs w:val="24"/>
+        </w:rPr>
+      </w:pPr>
+      <w:r>
+        <w:rPr>
+          <w:sz w:val="24"/>
+          <w:szCs w:val="24"/>
+        </w:rPr>
+        <w:t>Khi khách đến cửa hàng lấy xe.</w:t>
+      </w:r>
+    </w:p>
+    <w:p>
+      <w:pPr>
+        <w:numPr>
+          <w:ilvl w:val="0"/>
+          <w:numId w:val="4"/>
+        </w:numPr>
+        <w:rPr>
+          <w:sz w:val="24"/>
+          <w:szCs w:val="24"/>
+        </w:rPr>
+      </w:pPr>
+      <w:r>
+        <w:rPr>
+          <w:b/>
+          <w:bCs/>
+          <w:sz w:val="24"/>
+          <w:szCs w:val="24"/>
+        </w:rPr>
+        <w:t>Kiểm tra hồ sơ:</w:t>
+      </w:r>
+      <w:r>
+        <w:rPr>
+          <w:sz w:val="24"/>
+          <w:szCs w:val="24"/>
+        </w:rPr>
+        <w:t xml:space="preserve"> Nhân viên kiểm tra license_no (bằng lái) đã lưu trong bảng users.</w:t>
+      </w:r>
+    </w:p>
+    <w:p>
+      <w:pPr>
+        <w:numPr>
+          <w:ilvl w:val="0"/>
+          <w:numId w:val="4"/>
+        </w:numPr>
+        <w:rPr>
+          <w:sz w:val="24"/>
+          <w:szCs w:val="24"/>
+        </w:rPr>
+      </w:pPr>
+      <w:r>
+        <w:rPr>
+          <w:b/>
+          <w:bCs/>
+          <w:sz w:val="24"/>
+          <w:szCs w:val="24"/>
+        </w:rPr>
+        <w:t>Bàn giao:</w:t>
+      </w:r>
+      <w:r>
+        <w:rPr>
+          <w:sz w:val="24"/>
+          <w:szCs w:val="24"/>
+        </w:rPr>
+        <w:t xml:space="preserve"> Nhân viên cập nhật:</w:t>
+      </w:r>
+    </w:p>
+    <w:p>
+      <w:pPr>
+        <w:numPr>
+          <w:ilvl w:val="1"/>
+          <w:numId w:val="4"/>
+        </w:numPr>
+        <w:rPr>
+          <w:sz w:val="24"/>
+          <w:szCs w:val="24"/>
+        </w:rPr>
+      </w:pPr>
+      <w:proofErr w:type="gramStart"/>
+      <w:r>
+        <w:rPr>
+          <w:sz w:val="24"/>
+          <w:szCs w:val="24"/>
+        </w:rPr>
+        <w:t>bookings.actual</w:t>
+      </w:r>
+      <w:proofErr w:type="gramEnd"/>
+      <w:r>
+        <w:rPr>
+          <w:sz w:val="24"/>
+          <w:szCs w:val="24"/>
+        </w:rPr>
+        <w:t>_start_time = CURRENT_TIMESTAMP.</w:t>
+      </w:r>
+    </w:p>
+    <w:p>
+      <w:pPr>
+        <w:numPr>
+          <w:ilvl w:val="1"/>
+          <w:numId w:val="4"/>
+        </w:numPr>
+        <w:rPr>
+          <w:sz w:val="24"/>
+          <w:szCs w:val="24"/>
+        </w:rPr>
+      </w:pPr>
+      <w:proofErr w:type="gramStart"/>
+      <w:r>
+        <w:rPr>
+          <w:sz w:val="24"/>
+          <w:szCs w:val="24"/>
+        </w:rPr>
+        <w:t>bookings.status</w:t>
+      </w:r>
+      <w:proofErr w:type="gramEnd"/>
+      <w:r>
+        <w:rPr>
+          <w:sz w:val="24"/>
+          <w:szCs w:val="24"/>
+        </w:rPr>
+        <w:t xml:space="preserve"> = 'picked_up'.</w:t>
+      </w:r>
+    </w:p>
+    <w:p>
+      <w:pPr>
+        <w:numPr>
+          <w:ilvl w:val="1"/>
+          <w:numId w:val="4"/>
+        </w:numPr>
+        <w:rPr>
+          <w:sz w:val="24"/>
+          <w:szCs w:val="24"/>
+        </w:rPr>
+      </w:pPr>
+      <w:proofErr w:type="gramStart"/>
+      <w:r>
+        <w:rPr>
+          <w:sz w:val="24"/>
+          <w:szCs w:val="24"/>
+        </w:rPr>
+        <w:t>vehicles.status</w:t>
+      </w:r>
+      <w:proofErr w:type="gramEnd"/>
+      <w:r>
+        <w:rPr>
+          <w:sz w:val="24"/>
+          <w:szCs w:val="24"/>
+        </w:rPr>
+        <w:t xml:space="preserve"> = 'rented'.</w:t>
+      </w:r>
+    </w:p>
+    <w:p>
+      <w:pPr>
+        <w:numPr>
+          <w:ilvl w:val="0"/>
+          <w:numId w:val="4"/>
+        </w:numPr>
+        <w:rPr>
+          <w:sz w:val="24"/>
+          <w:szCs w:val="24"/>
+        </w:rPr>
+      </w:pPr>
+      <w:r>
+        <w:rPr>
+          <w:b/>
+          <w:bCs/>
+          <w:sz w:val="24"/>
+          <w:szCs w:val="24"/>
+        </w:rPr>
+        <w:t>Ghi nhận trạng thái:</w:t>
+      </w:r>
+      <w:r>
+        <w:rPr>
+          <w:sz w:val="24"/>
+          <w:szCs w:val="24"/>
+        </w:rPr>
+        <w:t xml:space="preserve"> Ghi lại battery_level lúc giao xe để đối chiếu khi trả.</w:t>
+      </w:r>
+    </w:p>
+    <w:p>
+      <w:pPr>
+        <w:rPr>
+          <w:b/>
+          <w:bCs/>
+          <w:sz w:val="24"/>
+          <w:szCs w:val="24"/>
+        </w:rPr>
+      </w:pPr>
+      <w:r>
+        <w:rPr>
+          <w:b/>
+          <w:bCs/>
+          <w:sz w:val="24"/>
+          <w:szCs w:val="24"/>
+        </w:rPr>
+        <w:t>2.</w:t>
+      </w:r>
+      <w:r>
+        <w:rPr>
+          <w:b/>
+          <w:bCs/>
+          <w:sz w:val="24"/>
+          <w:szCs w:val="24"/>
+        </w:rPr>
+        <w:t>4</w:t>
+      </w:r>
+      <w:r>
+        <w:rPr>
+          <w:b/>
+          <w:bCs/>
+          <w:sz w:val="24"/>
+          <w:szCs w:val="24"/>
+        </w:rPr>
+        <w:t>,</w:t>
+      </w:r>
+      <w:r>
+        <w:rPr>
+          <w:b/>
+          <w:bCs/>
+          <w:sz w:val="24"/>
+          <w:szCs w:val="24"/>
+        </w:rPr>
+        <w:t xml:space="preserve"> Sử dụng &amp; Trả xe (Return)</w:t>
+      </w:r>
+    </w:p>
+    <w:p>
+      <w:pPr>
+        <w:rPr>
+          <w:sz w:val="24"/>
+          <w:szCs w:val="24"/>
+        </w:rPr>
+      </w:pPr>
+      <w:r>
+        <w:rPr>
+          <w:sz w:val="24"/>
+          <w:szCs w:val="24"/>
+        </w:rPr>
+        <w:lastRenderedPageBreak/>
+        <w:t>Khách dùng xe và trả lại bãi.</w:t>
+      </w:r>
+    </w:p>
+    <w:p>
+      <w:pPr>
+        <w:numPr>
+          <w:ilvl w:val="0"/>
+          <w:numId w:val="5"/>
+        </w:numPr>
+        <w:rPr>
+          <w:sz w:val="24"/>
+          <w:szCs w:val="24"/>
+        </w:rPr>
+      </w:pPr>
+      <w:r>
+        <w:rPr>
+          <w:b/>
+          <w:bCs/>
+          <w:sz w:val="24"/>
+          <w:szCs w:val="24"/>
+        </w:rPr>
+        <w:t>Chốt thông số:</w:t>
+      </w:r>
+      <w:r>
+        <w:rPr>
+          <w:sz w:val="24"/>
+          <w:szCs w:val="24"/>
+        </w:rPr>
+        <w:t xml:space="preserve"> Khi khách trả xe, nhân viên cập nhật vào bảng bookings:</w:t>
+      </w:r>
+    </w:p>
+    <w:p>
+      <w:pPr>
+        <w:numPr>
+          <w:ilvl w:val="1"/>
+          <w:numId w:val="5"/>
+        </w:numPr>
+        <w:rPr>
+          <w:sz w:val="24"/>
+          <w:szCs w:val="24"/>
+        </w:rPr>
+      </w:pPr>
+      <w:r>
+        <w:rPr>
+          <w:sz w:val="24"/>
+          <w:szCs w:val="24"/>
+        </w:rPr>
+        <w:t>actual_end_time: Thời điểm trả thực tế.</w:t>
+      </w:r>
+    </w:p>
+    <w:p>
+      <w:pPr>
+        <w:numPr>
+          <w:ilvl w:val="1"/>
+          <w:numId w:val="5"/>
+        </w:numPr>
+        <w:rPr>
+          <w:sz w:val="24"/>
+          <w:szCs w:val="24"/>
+        </w:rPr>
+      </w:pPr>
+      <w:r>
+        <w:rPr>
+          <w:sz w:val="24"/>
+          <w:szCs w:val="24"/>
+        </w:rPr>
+        <w:t>actual_km: Số km đã đi (lấy từ đồng hồ xe trừ đi số cũ).</w:t>
+      </w:r>
+    </w:p>
+    <w:p>
+      <w:pPr>
+        <w:numPr>
+          <w:ilvl w:val="0"/>
+          <w:numId w:val="5"/>
+        </w:numPr>
+        <w:rPr>
+          <w:sz w:val="24"/>
+          <w:szCs w:val="24"/>
+        </w:rPr>
+      </w:pPr>
+      <w:r>
+        <w:rPr>
+          <w:b/>
+          <w:bCs/>
+          <w:sz w:val="24"/>
+          <w:szCs w:val="24"/>
+        </w:rPr>
+        <w:t>Tính toán phí phát sinh:</w:t>
+      </w:r>
+    </w:p>
+    <w:p>
+      <w:pPr>
+        <w:numPr>
+          <w:ilvl w:val="1"/>
+          <w:numId w:val="5"/>
+        </w:numPr>
+        <w:rPr>
+          <w:sz w:val="24"/>
+          <w:szCs w:val="24"/>
+        </w:rPr>
+      </w:pPr>
+      <w:r>
+        <w:rPr>
+          <w:b/>
+          <w:bCs/>
+          <w:sz w:val="24"/>
+          <w:szCs w:val="24"/>
+        </w:rPr>
+        <w:t>Quá giờ:</w:t>
+      </w:r>
+      <w:r>
+        <w:rPr>
+          <w:sz w:val="24"/>
+          <w:szCs w:val="24"/>
+        </w:rPr>
+        <w:t xml:space="preserve"> Nếu actual_end_time &gt; end_time, tính overtime_fee dựa trên overtime_price trong rental_plans.</w:t>
+      </w:r>
+    </w:p>
+    <w:p>
+      <w:pPr>
+        <w:numPr>
+          <w:ilvl w:val="1"/>
+          <w:numId w:val="5"/>
+        </w:numPr>
+        <w:rPr>
+          <w:sz w:val="24"/>
+          <w:szCs w:val="24"/>
+        </w:rPr>
+      </w:pPr>
+      <w:r>
+        <w:rPr>
+          <w:b/>
+          <w:bCs/>
+          <w:sz w:val="24"/>
+          <w:szCs w:val="24"/>
+        </w:rPr>
+        <w:t>Quá km:</w:t>
+      </w:r>
+      <w:r>
+        <w:rPr>
+          <w:sz w:val="24"/>
+          <w:szCs w:val="24"/>
+        </w:rPr>
+        <w:t xml:space="preserve"> Nếu actual_km &gt; max_km, tính over_km_fee.</w:t>
+      </w:r>
+    </w:p>
+    <w:p>
+      <w:pPr>
+        <w:numPr>
+          <w:ilvl w:val="0"/>
+          <w:numId w:val="5"/>
+        </w:numPr>
+        <w:rPr>
+          <w:sz w:val="24"/>
+          <w:szCs w:val="24"/>
+        </w:rPr>
+      </w:pPr>
+      <w:r>
+        <w:rPr>
+          <w:b/>
+          <w:bCs/>
+          <w:sz w:val="24"/>
+          <w:szCs w:val="24"/>
+        </w:rPr>
+        <w:t>Tổng kết:</w:t>
+      </w:r>
+      <w:r>
+        <w:rPr>
+          <w:sz w:val="24"/>
+          <w:szCs w:val="24"/>
+        </w:rPr>
+        <w:t xml:space="preserve"> Cập nhật total_price cuối cùng.</w:t>
+      </w:r>
+    </w:p>
+    <w:p>
+      <w:pPr>
+        <w:rPr>
+          <w:b/>
+          <w:bCs/>
+          <w:sz w:val="24"/>
+          <w:szCs w:val="24"/>
+        </w:rPr>
+      </w:pPr>
+      <w:r>
+        <w:rPr>
+          <w:b/>
+          <w:bCs/>
+          <w:sz w:val="24"/>
+          <w:szCs w:val="24"/>
+        </w:rPr>
+        <w:t>2.</w:t>
+      </w:r>
+      <w:r>
+        <w:rPr>
+          <w:b/>
+          <w:bCs/>
+          <w:sz w:val="24"/>
+          <w:szCs w:val="24"/>
+        </w:rPr>
+        <w:t>5</w:t>
+      </w:r>
+      <w:r>
+        <w:rPr>
+          <w:b/>
+          <w:bCs/>
+          <w:sz w:val="24"/>
+          <w:szCs w:val="24"/>
+        </w:rPr>
+        <w:t>,</w:t>
+      </w:r>
+      <w:r>
+        <w:rPr>
+          <w:b/>
+          <w:bCs/>
+          <w:sz w:val="24"/>
+          <w:szCs w:val="24"/>
+        </w:rPr>
+        <w:t xml:space="preserve"> Hoàn tất &amp; Đánh giá (Completion &amp; Review)</w:t>
+      </w:r>
+    </w:p>
+    <w:p>
+      <w:pPr>
+        <w:numPr>
+          <w:ilvl w:val="0"/>
+          <w:numId w:val="6"/>
+        </w:numPr>
+        <w:rPr>
+          <w:sz w:val="24"/>
+          <w:szCs w:val="24"/>
+        </w:rPr>
+      </w:pPr>
+      <w:r>
+        <w:rPr>
+          <w:b/>
+          <w:bCs/>
+          <w:sz w:val="24"/>
+          <w:szCs w:val="24"/>
+        </w:rPr>
+        <w:t>Thanh toán nốt:</w:t>
+      </w:r>
+      <w:r>
+        <w:rPr>
+          <w:sz w:val="24"/>
+          <w:szCs w:val="24"/>
+        </w:rPr>
+        <w:t xml:space="preserve"> Khách trả nốt phần tiền còn thiếu (nếu có) hoặc hệ thống trừ vào tiền cọc. </w:t>
+      </w:r>
+      <w:proofErr w:type="gramStart"/>
+      <w:r>
+        <w:rPr>
+          <w:sz w:val="24"/>
+          <w:szCs w:val="24"/>
+        </w:rPr>
+        <w:t>bookings.status</w:t>
+      </w:r>
+      <w:proofErr w:type="gramEnd"/>
+      <w:r>
+        <w:rPr>
+          <w:sz w:val="24"/>
+          <w:szCs w:val="24"/>
+        </w:rPr>
+        <w:t xml:space="preserve"> = 'completed'.</w:t>
+      </w:r>
+    </w:p>
+    <w:p>
+      <w:pPr>
+        <w:numPr>
+          <w:ilvl w:val="0"/>
+          <w:numId w:val="6"/>
+        </w:numPr>
+        <w:rPr>
+          <w:sz w:val="24"/>
+          <w:szCs w:val="24"/>
+        </w:rPr>
+      </w:pPr>
+      <w:r>
+        <w:rPr>
+          <w:b/>
+          <w:bCs/>
+          <w:sz w:val="24"/>
+          <w:szCs w:val="24"/>
+        </w:rPr>
+        <w:t>Giải phóng xe:</w:t>
+      </w:r>
+      <w:r>
+        <w:rPr>
+          <w:sz w:val="24"/>
+          <w:szCs w:val="24"/>
+        </w:rPr>
+        <w:t xml:space="preserve"> </w:t>
+      </w:r>
+      <w:proofErr w:type="gramStart"/>
+      <w:r>
+        <w:rPr>
+          <w:sz w:val="24"/>
+          <w:szCs w:val="24"/>
+        </w:rPr>
+        <w:t>vehicles.status</w:t>
+      </w:r>
+      <w:proofErr w:type="gramEnd"/>
+      <w:r>
+        <w:rPr>
+          <w:sz w:val="24"/>
+          <w:szCs w:val="24"/>
+        </w:rPr>
+        <w:t xml:space="preserve"> quay về 'available', battery_level được cập nhật mới.</w:t>
+      </w:r>
+    </w:p>
+    <w:p>
+      <w:pPr>
+        <w:numPr>
+          <w:ilvl w:val="0"/>
+          <w:numId w:val="6"/>
+        </w:numPr>
+        <w:rPr>
+          <w:sz w:val="24"/>
+          <w:szCs w:val="24"/>
+        </w:rPr>
+      </w:pPr>
+      <w:r>
+        <w:rPr>
+          <w:b/>
+          <w:bCs/>
+          <w:sz w:val="24"/>
+          <w:szCs w:val="24"/>
+        </w:rPr>
+        <w:t>Đánh giá:</w:t>
+      </w:r>
+      <w:r>
+        <w:rPr>
+          <w:sz w:val="24"/>
+          <w:szCs w:val="24"/>
+        </w:rPr>
+        <w:t xml:space="preserve"> Khách hàng vào bảng reviews để để lại cảm nhận về mẫu xe đó.</w:t>
+      </w:r>
+    </w:p>
+    <w:p>
+      <w:pPr>
+        <w:rPr>
+          <w:sz w:val="24"/>
+          <w:szCs w:val="24"/>
+        </w:rPr>
+      </w:pPr>
+    </w:p>
+    <w:p>
+      <w:pPr>
+        <w:rPr>
+          <w:sz w:val="24"/>
+          <w:szCs w:val="24"/>
+        </w:rPr>
+      </w:pPr>
+    </w:p>
+    <w:p>
+      <w:pPr>
+        <w:rPr>
+          <w:sz w:val="24"/>
+          <w:szCs w:val="24"/>
+        </w:rPr>
+      </w:pPr>
     </w:p>
     <w:sectPr>
       <w:pgSz w:w="12240" w:h="15840"/>
@@ -180,6 +1656,155 @@
 <file path=word/numbering.xml><?xml version="1.0" encoding="utf-8"?>
 <w:numbering xmlns:wpc="http://schemas.microsoft.com/office/word/2010/wordprocessingCanvas" xmlns:cx="http://schemas.microsoft.com/office/drawing/2014/chartex" xmlns:cx1="http://schemas.microsoft.com/office/drawing/2015/9/8/chartex" xmlns:cx2="http://schemas.microsoft.com/office/drawing/2015/10/21/chartex" xmlns:cx3="http://schemas.microsoft.com/office/drawing/2016/5/9/chartex" xmlns:cx4="http://schemas.microsoft.com/office/drawing/2016/5/10/chartex" xmlns:cx5="http://schemas.microsoft.com/office/drawing/2016/5/11/chartex" xmlns:cx6="http://schemas.microsoft.com/office/drawing/2016/5/12/chartex" xmlns:cx7="http://schemas.microsoft.com/office/drawing/2016/5/13/chartex" xmlns:cx8="http://schemas.microsoft.com/office/drawing/2016/5/14/chartex" xmlns:mc="http://schemas.openxmlformats.org/markup-compatibility/2006" xmlns:aink="http://schemas.microsoft.com/office/drawing/2016/ink" xmlns:am3d="http://schemas.microsoft.com/office/drawing/2017/model3d" xmlns:o="urn:schemas-microsoft-com:office:office" xmlns:oel="http://schemas.microsoft.com/office/2019/extlst" xmlns:r="http://schemas.openxmlformats.org/officeDocument/2006/relationships" xmlns:m="http://schemas.openxmlformats.org/officeDocument/2006/math" xmlns:v="urn:schemas-microsoft-com:vml" xmlns:wp14="http://schemas.microsoft.com/office/word/2010/wordprocessingDrawing" xmlns:wp="http://schemas.openxmlformats.org/drawingml/2006/wordprocessingDrawing" xmlns:w10="urn:schemas-microsoft-com:office:word" xmlns:w="http://schemas.openxmlformats.org/wordprocessingml/2006/main" xmlns:w14="http://schemas.microsoft.com/office/word/2010/wordml" xmlns:w15="http://schemas.microsoft.com/office/word/2012/wordml" xmlns:w16cex="http://schemas.microsoft.com/office/word/2018/wordml/cex" xmlns:w16cid="http://schemas.microsoft.com/office/word/2016/wordml/cid" xmlns:w16="http://schemas.microsoft.com/office/word/2018/wordml" xmlns:w16du="http://schemas.microsoft.com/office/word/2023/wordml/word16du" xmlns:w16sdtdh="http://schemas.microsoft.com/office/word/2020/wordml/sdtdatahash" xmlns:w16sdtfl="http://schemas.microsoft.com/office/word/2024/wordml/sdtformatlock" xmlns:w16se="http://schemas.microsoft.com/office/word/2015/wordml/symex" xmlns:wpg="http://schemas.microsoft.com/office/word/2010/wordprocessingGroup" xmlns:wpi="http://schemas.microsoft.com/office/word/2010/wordprocessingInk" xmlns:wne="http://schemas.microsoft.com/office/word/2006/wordml" xmlns:wps="http://schemas.microsoft.com/office/word/2010/wordprocessingShape" mc:Ignorable="w14 w15 w16se w16cid w16 w16cex w16sdtdh w16sdtfl w16du wp14">
   <w:abstractNum w:abstractNumId="0" w15:restartNumberingAfterBreak="0">
+    <w:nsid w:val="027B5DB2"/>
+    <w:multiLevelType w:val="multilevel"/>
+    <w:tmpl w:val="970067A6"/>
+    <w:lvl w:ilvl="0">
+      <w:start w:val="1"/>
+      <w:numFmt w:val="bullet"/>
+      <w:lvlText w:val=""/>
+      <w:lvlJc w:val="left"/>
+      <w:pPr>
+        <w:tabs>
+          <w:tab w:val="num" w:pos="720"/>
+        </w:tabs>
+        <w:ind w:left="720" w:hanging="360"/>
+      </w:pPr>
+      <w:rPr>
+        <w:rFonts w:ascii="Symbol" w:hAnsi="Symbol" w:hint="default"/>
+        <w:sz w:val="20"/>
+      </w:rPr>
+    </w:lvl>
+    <w:lvl w:ilvl="1">
+      <w:start w:val="1"/>
+      <w:numFmt w:val="bullet"/>
+      <w:lvlText w:val="o"/>
+      <w:lvlJc w:val="left"/>
+      <w:pPr>
+        <w:tabs>
+          <w:tab w:val="num" w:pos="1440"/>
+        </w:tabs>
+        <w:ind w:left="1440" w:hanging="360"/>
+      </w:pPr>
+      <w:rPr>
+        <w:rFonts w:ascii="Courier New" w:hAnsi="Courier New" w:hint="default"/>
+        <w:sz w:val="20"/>
+      </w:rPr>
+    </w:lvl>
+    <w:lvl w:ilvl="2" w:tentative="1">
+      <w:start w:val="1"/>
+      <w:numFmt w:val="bullet"/>
+      <w:lvlText w:val=""/>
+      <w:lvlJc w:val="left"/>
+      <w:pPr>
+        <w:tabs>
+          <w:tab w:val="num" w:pos="2160"/>
+        </w:tabs>
+        <w:ind w:left="2160" w:hanging="360"/>
+      </w:pPr>
+      <w:rPr>
+        <w:rFonts w:ascii="Wingdings" w:hAnsi="Wingdings" w:hint="default"/>
+        <w:sz w:val="20"/>
+      </w:rPr>
+    </w:lvl>
+    <w:lvl w:ilvl="3" w:tentative="1">
+      <w:start w:val="1"/>
+      <w:numFmt w:val="bullet"/>
+      <w:lvlText w:val=""/>
+      <w:lvlJc w:val="left"/>
+      <w:pPr>
+        <w:tabs>
+          <w:tab w:val="num" w:pos="2880"/>
+        </w:tabs>
+        <w:ind w:left="2880" w:hanging="360"/>
+      </w:pPr>
+      <w:rPr>
+        <w:rFonts w:ascii="Wingdings" w:hAnsi="Wingdings" w:hint="default"/>
+        <w:sz w:val="20"/>
+      </w:rPr>
+    </w:lvl>
+    <w:lvl w:ilvl="4" w:tentative="1">
+      <w:start w:val="1"/>
+      <w:numFmt w:val="bullet"/>
+      <w:lvlText w:val=""/>
+      <w:lvlJc w:val="left"/>
+      <w:pPr>
+        <w:tabs>
+          <w:tab w:val="num" w:pos="3600"/>
+        </w:tabs>
+        <w:ind w:left="3600" w:hanging="360"/>
+      </w:pPr>
+      <w:rPr>
+        <w:rFonts w:ascii="Wingdings" w:hAnsi="Wingdings" w:hint="default"/>
+        <w:sz w:val="20"/>
+      </w:rPr>
+    </w:lvl>
+    <w:lvl w:ilvl="5" w:tentative="1">
+      <w:start w:val="1"/>
+      <w:numFmt w:val="bullet"/>
+      <w:lvlText w:val=""/>
+      <w:lvlJc w:val="left"/>
+      <w:pPr>
+        <w:tabs>
+          <w:tab w:val="num" w:pos="4320"/>
+        </w:tabs>
+        <w:ind w:left="4320" w:hanging="360"/>
+      </w:pPr>
+      <w:rPr>
+        <w:rFonts w:ascii="Wingdings" w:hAnsi="Wingdings" w:hint="default"/>
+        <w:sz w:val="20"/>
+      </w:rPr>
+    </w:lvl>
+    <w:lvl w:ilvl="6" w:tentative="1">
+      <w:start w:val="1"/>
+      <w:numFmt w:val="bullet"/>
+      <w:lvlText w:val=""/>
+      <w:lvlJc w:val="left"/>
+      <w:pPr>
+        <w:tabs>
+          <w:tab w:val="num" w:pos="5040"/>
+        </w:tabs>
+        <w:ind w:left="5040" w:hanging="360"/>
+      </w:pPr>
+      <w:rPr>
+        <w:rFonts w:ascii="Wingdings" w:hAnsi="Wingdings" w:hint="default"/>
+        <w:sz w:val="20"/>
+      </w:rPr>
+    </w:lvl>
+    <w:lvl w:ilvl="7" w:tentative="1">
+      <w:start w:val="1"/>
+      <w:numFmt w:val="bullet"/>
+      <w:lvlText w:val=""/>
+      <w:lvlJc w:val="left"/>
+      <w:pPr>
+        <w:tabs>
+          <w:tab w:val="num" w:pos="5760"/>
+        </w:tabs>
+        <w:ind w:left="5760" w:hanging="360"/>
+      </w:pPr>
+      <w:rPr>
+        <w:rFonts w:ascii="Wingdings" w:hAnsi="Wingdings" w:hint="default"/>
+        <w:sz w:val="20"/>
+      </w:rPr>
+    </w:lvl>
+    <w:lvl w:ilvl="8" w:tentative="1">
+      <w:start w:val="1"/>
+      <w:numFmt w:val="bullet"/>
+      <w:lvlText w:val=""/>
+      <w:lvlJc w:val="left"/>
+      <w:pPr>
+        <w:tabs>
+          <w:tab w:val="num" w:pos="6480"/>
+        </w:tabs>
+        <w:ind w:left="6480" w:hanging="360"/>
+      </w:pPr>
+      <w:rPr>
+        <w:rFonts w:ascii="Wingdings" w:hAnsi="Wingdings" w:hint="default"/>
+        <w:sz w:val="20"/>
+      </w:rPr>
+    </w:lvl>
+  </w:abstractNum>
+  <w:abstractNum w:abstractNumId="1" w15:restartNumberingAfterBreak="0">
     <w:nsid w:val="318508C3"/>
     <w:multiLevelType w:val="hybridMultilevel"/>
     <w:tmpl w:val="B34C0272"/>
@@ -291,8 +1916,619 @@
       </w:rPr>
     </w:lvl>
   </w:abstractNum>
+  <w:abstractNum w:abstractNumId="2" w15:restartNumberingAfterBreak="0">
+    <w:nsid w:val="49795883"/>
+    <w:multiLevelType w:val="multilevel"/>
+    <w:tmpl w:val="B9383770"/>
+    <w:lvl w:ilvl="0">
+      <w:start w:val="1"/>
+      <w:numFmt w:val="bullet"/>
+      <w:lvlText w:val=""/>
+      <w:lvlJc w:val="left"/>
+      <w:pPr>
+        <w:tabs>
+          <w:tab w:val="num" w:pos="720"/>
+        </w:tabs>
+        <w:ind w:left="720" w:hanging="360"/>
+      </w:pPr>
+      <w:rPr>
+        <w:rFonts w:ascii="Symbol" w:hAnsi="Symbol" w:hint="default"/>
+        <w:sz w:val="20"/>
+      </w:rPr>
+    </w:lvl>
+    <w:lvl w:ilvl="1">
+      <w:start w:val="1"/>
+      <w:numFmt w:val="bullet"/>
+      <w:lvlText w:val="o"/>
+      <w:lvlJc w:val="left"/>
+      <w:pPr>
+        <w:tabs>
+          <w:tab w:val="num" w:pos="1440"/>
+        </w:tabs>
+        <w:ind w:left="1440" w:hanging="360"/>
+      </w:pPr>
+      <w:rPr>
+        <w:rFonts w:ascii="Courier New" w:hAnsi="Courier New" w:hint="default"/>
+        <w:sz w:val="20"/>
+      </w:rPr>
+    </w:lvl>
+    <w:lvl w:ilvl="2" w:tentative="1">
+      <w:start w:val="1"/>
+      <w:numFmt w:val="bullet"/>
+      <w:lvlText w:val=""/>
+      <w:lvlJc w:val="left"/>
+      <w:pPr>
+        <w:tabs>
+          <w:tab w:val="num" w:pos="2160"/>
+        </w:tabs>
+        <w:ind w:left="2160" w:hanging="360"/>
+      </w:pPr>
+      <w:rPr>
+        <w:rFonts w:ascii="Wingdings" w:hAnsi="Wingdings" w:hint="default"/>
+        <w:sz w:val="20"/>
+      </w:rPr>
+    </w:lvl>
+    <w:lvl w:ilvl="3" w:tentative="1">
+      <w:start w:val="1"/>
+      <w:numFmt w:val="bullet"/>
+      <w:lvlText w:val=""/>
+      <w:lvlJc w:val="left"/>
+      <w:pPr>
+        <w:tabs>
+          <w:tab w:val="num" w:pos="2880"/>
+        </w:tabs>
+        <w:ind w:left="2880" w:hanging="360"/>
+      </w:pPr>
+      <w:rPr>
+        <w:rFonts w:ascii="Wingdings" w:hAnsi="Wingdings" w:hint="default"/>
+        <w:sz w:val="20"/>
+      </w:rPr>
+    </w:lvl>
+    <w:lvl w:ilvl="4" w:tentative="1">
+      <w:start w:val="1"/>
+      <w:numFmt w:val="bullet"/>
+      <w:lvlText w:val=""/>
+      <w:lvlJc w:val="left"/>
+      <w:pPr>
+        <w:tabs>
+          <w:tab w:val="num" w:pos="3600"/>
+        </w:tabs>
+        <w:ind w:left="3600" w:hanging="360"/>
+      </w:pPr>
+      <w:rPr>
+        <w:rFonts w:ascii="Wingdings" w:hAnsi="Wingdings" w:hint="default"/>
+        <w:sz w:val="20"/>
+      </w:rPr>
+    </w:lvl>
+    <w:lvl w:ilvl="5" w:tentative="1">
+      <w:start w:val="1"/>
+      <w:numFmt w:val="bullet"/>
+      <w:lvlText w:val=""/>
+      <w:lvlJc w:val="left"/>
+      <w:pPr>
+        <w:tabs>
+          <w:tab w:val="num" w:pos="4320"/>
+        </w:tabs>
+        <w:ind w:left="4320" w:hanging="360"/>
+      </w:pPr>
+      <w:rPr>
+        <w:rFonts w:ascii="Wingdings" w:hAnsi="Wingdings" w:hint="default"/>
+        <w:sz w:val="20"/>
+      </w:rPr>
+    </w:lvl>
+    <w:lvl w:ilvl="6" w:tentative="1">
+      <w:start w:val="1"/>
+      <w:numFmt w:val="bullet"/>
+      <w:lvlText w:val=""/>
+      <w:lvlJc w:val="left"/>
+      <w:pPr>
+        <w:tabs>
+          <w:tab w:val="num" w:pos="5040"/>
+        </w:tabs>
+        <w:ind w:left="5040" w:hanging="360"/>
+      </w:pPr>
+      <w:rPr>
+        <w:rFonts w:ascii="Wingdings" w:hAnsi="Wingdings" w:hint="default"/>
+        <w:sz w:val="20"/>
+      </w:rPr>
+    </w:lvl>
+    <w:lvl w:ilvl="7" w:tentative="1">
+      <w:start w:val="1"/>
+      <w:numFmt w:val="bullet"/>
+      <w:lvlText w:val=""/>
+      <w:lvlJc w:val="left"/>
+      <w:pPr>
+        <w:tabs>
+          <w:tab w:val="num" w:pos="5760"/>
+        </w:tabs>
+        <w:ind w:left="5760" w:hanging="360"/>
+      </w:pPr>
+      <w:rPr>
+        <w:rFonts w:ascii="Wingdings" w:hAnsi="Wingdings" w:hint="default"/>
+        <w:sz w:val="20"/>
+      </w:rPr>
+    </w:lvl>
+    <w:lvl w:ilvl="8" w:tentative="1">
+      <w:start w:val="1"/>
+      <w:numFmt w:val="bullet"/>
+      <w:lvlText w:val=""/>
+      <w:lvlJc w:val="left"/>
+      <w:pPr>
+        <w:tabs>
+          <w:tab w:val="num" w:pos="6480"/>
+        </w:tabs>
+        <w:ind w:left="6480" w:hanging="360"/>
+      </w:pPr>
+      <w:rPr>
+        <w:rFonts w:ascii="Wingdings" w:hAnsi="Wingdings" w:hint="default"/>
+        <w:sz w:val="20"/>
+      </w:rPr>
+    </w:lvl>
+  </w:abstractNum>
+  <w:abstractNum w:abstractNumId="3" w15:restartNumberingAfterBreak="0">
+    <w:nsid w:val="6C583F3D"/>
+    <w:multiLevelType w:val="multilevel"/>
+    <w:tmpl w:val="7F8807E6"/>
+    <w:lvl w:ilvl="0">
+      <w:start w:val="1"/>
+      <w:numFmt w:val="bullet"/>
+      <w:lvlText w:val=""/>
+      <w:lvlJc w:val="left"/>
+      <w:pPr>
+        <w:tabs>
+          <w:tab w:val="num" w:pos="720"/>
+        </w:tabs>
+        <w:ind w:left="720" w:hanging="360"/>
+      </w:pPr>
+      <w:rPr>
+        <w:rFonts w:ascii="Symbol" w:hAnsi="Symbol" w:hint="default"/>
+        <w:sz w:val="20"/>
+      </w:rPr>
+    </w:lvl>
+    <w:lvl w:ilvl="1">
+      <w:start w:val="1"/>
+      <w:numFmt w:val="bullet"/>
+      <w:lvlText w:val="o"/>
+      <w:lvlJc w:val="left"/>
+      <w:pPr>
+        <w:tabs>
+          <w:tab w:val="num" w:pos="1440"/>
+        </w:tabs>
+        <w:ind w:left="1440" w:hanging="360"/>
+      </w:pPr>
+      <w:rPr>
+        <w:rFonts w:ascii="Courier New" w:hAnsi="Courier New" w:hint="default"/>
+        <w:sz w:val="20"/>
+      </w:rPr>
+    </w:lvl>
+    <w:lvl w:ilvl="2" w:tentative="1">
+      <w:start w:val="1"/>
+      <w:numFmt w:val="bullet"/>
+      <w:lvlText w:val=""/>
+      <w:lvlJc w:val="left"/>
+      <w:pPr>
+        <w:tabs>
+          <w:tab w:val="num" w:pos="2160"/>
+        </w:tabs>
+        <w:ind w:left="2160" w:hanging="360"/>
+      </w:pPr>
+      <w:rPr>
+        <w:rFonts w:ascii="Wingdings" w:hAnsi="Wingdings" w:hint="default"/>
+        <w:sz w:val="20"/>
+      </w:rPr>
+    </w:lvl>
+    <w:lvl w:ilvl="3" w:tentative="1">
+      <w:start w:val="1"/>
+      <w:numFmt w:val="bullet"/>
+      <w:lvlText w:val=""/>
+      <w:lvlJc w:val="left"/>
+      <w:pPr>
+        <w:tabs>
+          <w:tab w:val="num" w:pos="2880"/>
+        </w:tabs>
+        <w:ind w:left="2880" w:hanging="360"/>
+      </w:pPr>
+      <w:rPr>
+        <w:rFonts w:ascii="Wingdings" w:hAnsi="Wingdings" w:hint="default"/>
+        <w:sz w:val="20"/>
+      </w:rPr>
+    </w:lvl>
+    <w:lvl w:ilvl="4" w:tentative="1">
+      <w:start w:val="1"/>
+      <w:numFmt w:val="bullet"/>
+      <w:lvlText w:val=""/>
+      <w:lvlJc w:val="left"/>
+      <w:pPr>
+        <w:tabs>
+          <w:tab w:val="num" w:pos="3600"/>
+        </w:tabs>
+        <w:ind w:left="3600" w:hanging="360"/>
+      </w:pPr>
+      <w:rPr>
+        <w:rFonts w:ascii="Wingdings" w:hAnsi="Wingdings" w:hint="default"/>
+        <w:sz w:val="20"/>
+      </w:rPr>
+    </w:lvl>
+    <w:lvl w:ilvl="5" w:tentative="1">
+      <w:start w:val="1"/>
+      <w:numFmt w:val="bullet"/>
+      <w:lvlText w:val=""/>
+      <w:lvlJc w:val="left"/>
+      <w:pPr>
+        <w:tabs>
+          <w:tab w:val="num" w:pos="4320"/>
+        </w:tabs>
+        <w:ind w:left="4320" w:hanging="360"/>
+      </w:pPr>
+      <w:rPr>
+        <w:rFonts w:ascii="Wingdings" w:hAnsi="Wingdings" w:hint="default"/>
+        <w:sz w:val="20"/>
+      </w:rPr>
+    </w:lvl>
+    <w:lvl w:ilvl="6" w:tentative="1">
+      <w:start w:val="1"/>
+      <w:numFmt w:val="bullet"/>
+      <w:lvlText w:val=""/>
+      <w:lvlJc w:val="left"/>
+      <w:pPr>
+        <w:tabs>
+          <w:tab w:val="num" w:pos="5040"/>
+        </w:tabs>
+        <w:ind w:left="5040" w:hanging="360"/>
+      </w:pPr>
+      <w:rPr>
+        <w:rFonts w:ascii="Wingdings" w:hAnsi="Wingdings" w:hint="default"/>
+        <w:sz w:val="20"/>
+      </w:rPr>
+    </w:lvl>
+    <w:lvl w:ilvl="7" w:tentative="1">
+      <w:start w:val="1"/>
+      <w:numFmt w:val="bullet"/>
+      <w:lvlText w:val=""/>
+      <w:lvlJc w:val="left"/>
+      <w:pPr>
+        <w:tabs>
+          <w:tab w:val="num" w:pos="5760"/>
+        </w:tabs>
+        <w:ind w:left="5760" w:hanging="360"/>
+      </w:pPr>
+      <w:rPr>
+        <w:rFonts w:ascii="Wingdings" w:hAnsi="Wingdings" w:hint="default"/>
+        <w:sz w:val="20"/>
+      </w:rPr>
+    </w:lvl>
+    <w:lvl w:ilvl="8" w:tentative="1">
+      <w:start w:val="1"/>
+      <w:numFmt w:val="bullet"/>
+      <w:lvlText w:val=""/>
+      <w:lvlJc w:val="left"/>
+      <w:pPr>
+        <w:tabs>
+          <w:tab w:val="num" w:pos="6480"/>
+        </w:tabs>
+        <w:ind w:left="6480" w:hanging="360"/>
+      </w:pPr>
+      <w:rPr>
+        <w:rFonts w:ascii="Wingdings" w:hAnsi="Wingdings" w:hint="default"/>
+        <w:sz w:val="20"/>
+      </w:rPr>
+    </w:lvl>
+  </w:abstractNum>
+  <w:abstractNum w:abstractNumId="4" w15:restartNumberingAfterBreak="0">
+    <w:nsid w:val="6F766228"/>
+    <w:multiLevelType w:val="multilevel"/>
+    <w:tmpl w:val="C0CABB8E"/>
+    <w:lvl w:ilvl="0">
+      <w:start w:val="1"/>
+      <w:numFmt w:val="bullet"/>
+      <w:lvlText w:val=""/>
+      <w:lvlJc w:val="left"/>
+      <w:pPr>
+        <w:tabs>
+          <w:tab w:val="num" w:pos="720"/>
+        </w:tabs>
+        <w:ind w:left="720" w:hanging="360"/>
+      </w:pPr>
+      <w:rPr>
+        <w:rFonts w:ascii="Symbol" w:hAnsi="Symbol" w:hint="default"/>
+        <w:sz w:val="20"/>
+      </w:rPr>
+    </w:lvl>
+    <w:lvl w:ilvl="1" w:tentative="1">
+      <w:start w:val="1"/>
+      <w:numFmt w:val="bullet"/>
+      <w:lvlText w:val="o"/>
+      <w:lvlJc w:val="left"/>
+      <w:pPr>
+        <w:tabs>
+          <w:tab w:val="num" w:pos="1440"/>
+        </w:tabs>
+        <w:ind w:left="1440" w:hanging="360"/>
+      </w:pPr>
+      <w:rPr>
+        <w:rFonts w:ascii="Courier New" w:hAnsi="Courier New" w:hint="default"/>
+        <w:sz w:val="20"/>
+      </w:rPr>
+    </w:lvl>
+    <w:lvl w:ilvl="2" w:tentative="1">
+      <w:start w:val="1"/>
+      <w:numFmt w:val="bullet"/>
+      <w:lvlText w:val=""/>
+      <w:lvlJc w:val="left"/>
+      <w:pPr>
+        <w:tabs>
+          <w:tab w:val="num" w:pos="2160"/>
+        </w:tabs>
+        <w:ind w:left="2160" w:hanging="360"/>
+      </w:pPr>
+      <w:rPr>
+        <w:rFonts w:ascii="Wingdings" w:hAnsi="Wingdings" w:hint="default"/>
+        <w:sz w:val="20"/>
+      </w:rPr>
+    </w:lvl>
+    <w:lvl w:ilvl="3" w:tentative="1">
+      <w:start w:val="1"/>
+      <w:numFmt w:val="bullet"/>
+      <w:lvlText w:val=""/>
+      <w:lvlJc w:val="left"/>
+      <w:pPr>
+        <w:tabs>
+          <w:tab w:val="num" w:pos="2880"/>
+        </w:tabs>
+        <w:ind w:left="2880" w:hanging="360"/>
+      </w:pPr>
+      <w:rPr>
+        <w:rFonts w:ascii="Wingdings" w:hAnsi="Wingdings" w:hint="default"/>
+        <w:sz w:val="20"/>
+      </w:rPr>
+    </w:lvl>
+    <w:lvl w:ilvl="4" w:tentative="1">
+      <w:start w:val="1"/>
+      <w:numFmt w:val="bullet"/>
+      <w:lvlText w:val=""/>
+      <w:lvlJc w:val="left"/>
+      <w:pPr>
+        <w:tabs>
+          <w:tab w:val="num" w:pos="3600"/>
+        </w:tabs>
+        <w:ind w:left="3600" w:hanging="360"/>
+      </w:pPr>
+      <w:rPr>
+        <w:rFonts w:ascii="Wingdings" w:hAnsi="Wingdings" w:hint="default"/>
+        <w:sz w:val="20"/>
+      </w:rPr>
+    </w:lvl>
+    <w:lvl w:ilvl="5" w:tentative="1">
+      <w:start w:val="1"/>
+      <w:numFmt w:val="bullet"/>
+      <w:lvlText w:val=""/>
+      <w:lvlJc w:val="left"/>
+      <w:pPr>
+        <w:tabs>
+          <w:tab w:val="num" w:pos="4320"/>
+        </w:tabs>
+        <w:ind w:left="4320" w:hanging="360"/>
+      </w:pPr>
+      <w:rPr>
+        <w:rFonts w:ascii="Wingdings" w:hAnsi="Wingdings" w:hint="default"/>
+        <w:sz w:val="20"/>
+      </w:rPr>
+    </w:lvl>
+    <w:lvl w:ilvl="6" w:tentative="1">
+      <w:start w:val="1"/>
+      <w:numFmt w:val="bullet"/>
+      <w:lvlText w:val=""/>
+      <w:lvlJc w:val="left"/>
+      <w:pPr>
+        <w:tabs>
+          <w:tab w:val="num" w:pos="5040"/>
+        </w:tabs>
+        <w:ind w:left="5040" w:hanging="360"/>
+      </w:pPr>
+      <w:rPr>
+        <w:rFonts w:ascii="Wingdings" w:hAnsi="Wingdings" w:hint="default"/>
+        <w:sz w:val="20"/>
+      </w:rPr>
+    </w:lvl>
+    <w:lvl w:ilvl="7" w:tentative="1">
+      <w:start w:val="1"/>
+      <w:numFmt w:val="bullet"/>
+      <w:lvlText w:val=""/>
+      <w:lvlJc w:val="left"/>
+      <w:pPr>
+        <w:tabs>
+          <w:tab w:val="num" w:pos="5760"/>
+        </w:tabs>
+        <w:ind w:left="5760" w:hanging="360"/>
+      </w:pPr>
+      <w:rPr>
+        <w:rFonts w:ascii="Wingdings" w:hAnsi="Wingdings" w:hint="default"/>
+        <w:sz w:val="20"/>
+      </w:rPr>
+    </w:lvl>
+    <w:lvl w:ilvl="8" w:tentative="1">
+      <w:start w:val="1"/>
+      <w:numFmt w:val="bullet"/>
+      <w:lvlText w:val=""/>
+      <w:lvlJc w:val="left"/>
+      <w:pPr>
+        <w:tabs>
+          <w:tab w:val="num" w:pos="6480"/>
+        </w:tabs>
+        <w:ind w:left="6480" w:hanging="360"/>
+      </w:pPr>
+      <w:rPr>
+        <w:rFonts w:ascii="Wingdings" w:hAnsi="Wingdings" w:hint="default"/>
+        <w:sz w:val="20"/>
+      </w:rPr>
+    </w:lvl>
+  </w:abstractNum>
+  <w:abstractNum w:abstractNumId="5" w15:restartNumberingAfterBreak="0">
+    <w:nsid w:val="77A367B5"/>
+    <w:multiLevelType w:val="multilevel"/>
+    <w:tmpl w:val="AFBC62BA"/>
+    <w:lvl w:ilvl="0">
+      <w:start w:val="1"/>
+      <w:numFmt w:val="bullet"/>
+      <w:lvlText w:val=""/>
+      <w:lvlJc w:val="left"/>
+      <w:pPr>
+        <w:tabs>
+          <w:tab w:val="num" w:pos="720"/>
+        </w:tabs>
+        <w:ind w:left="720" w:hanging="360"/>
+      </w:pPr>
+      <w:rPr>
+        <w:rFonts w:ascii="Symbol" w:hAnsi="Symbol" w:hint="default"/>
+        <w:sz w:val="20"/>
+      </w:rPr>
+    </w:lvl>
+    <w:lvl w:ilvl="1" w:tentative="1">
+      <w:start w:val="1"/>
+      <w:numFmt w:val="bullet"/>
+      <w:lvlText w:val="o"/>
+      <w:lvlJc w:val="left"/>
+      <w:pPr>
+        <w:tabs>
+          <w:tab w:val="num" w:pos="1440"/>
+        </w:tabs>
+        <w:ind w:left="1440" w:hanging="360"/>
+      </w:pPr>
+      <w:rPr>
+        <w:rFonts w:ascii="Courier New" w:hAnsi="Courier New" w:hint="default"/>
+        <w:sz w:val="20"/>
+      </w:rPr>
+    </w:lvl>
+    <w:lvl w:ilvl="2" w:tentative="1">
+      <w:start w:val="1"/>
+      <w:numFmt w:val="bullet"/>
+      <w:lvlText w:val=""/>
+      <w:lvlJc w:val="left"/>
+      <w:pPr>
+        <w:tabs>
+          <w:tab w:val="num" w:pos="2160"/>
+        </w:tabs>
+        <w:ind w:left="2160" w:hanging="360"/>
+      </w:pPr>
+      <w:rPr>
+        <w:rFonts w:ascii="Wingdings" w:hAnsi="Wingdings" w:hint="default"/>
+        <w:sz w:val="20"/>
+      </w:rPr>
+    </w:lvl>
+    <w:lvl w:ilvl="3" w:tentative="1">
+      <w:start w:val="1"/>
+      <w:numFmt w:val="bullet"/>
+      <w:lvlText w:val=""/>
+      <w:lvlJc w:val="left"/>
+      <w:pPr>
+        <w:tabs>
+          <w:tab w:val="num" w:pos="2880"/>
+        </w:tabs>
+        <w:ind w:left="2880" w:hanging="360"/>
+      </w:pPr>
+      <w:rPr>
+        <w:rFonts w:ascii="Wingdings" w:hAnsi="Wingdings" w:hint="default"/>
+        <w:sz w:val="20"/>
+      </w:rPr>
+    </w:lvl>
+    <w:lvl w:ilvl="4" w:tentative="1">
+      <w:start w:val="1"/>
+      <w:numFmt w:val="bullet"/>
+      <w:lvlText w:val=""/>
+      <w:lvlJc w:val="left"/>
+      <w:pPr>
+        <w:tabs>
+          <w:tab w:val="num" w:pos="3600"/>
+        </w:tabs>
+        <w:ind w:left="3600" w:hanging="360"/>
+      </w:pPr>
+      <w:rPr>
+        <w:rFonts w:ascii="Wingdings" w:hAnsi="Wingdings" w:hint="default"/>
+        <w:sz w:val="20"/>
+      </w:rPr>
+    </w:lvl>
+    <w:lvl w:ilvl="5" w:tentative="1">
+      <w:start w:val="1"/>
+      <w:numFmt w:val="bullet"/>
+      <w:lvlText w:val=""/>
+      <w:lvlJc w:val="left"/>
+      <w:pPr>
+        <w:tabs>
+          <w:tab w:val="num" w:pos="4320"/>
+        </w:tabs>
+        <w:ind w:left="4320" w:hanging="360"/>
+      </w:pPr>
+      <w:rPr>
+        <w:rFonts w:ascii="Wingdings" w:hAnsi="Wingdings" w:hint="default"/>
+        <w:sz w:val="20"/>
+      </w:rPr>
+    </w:lvl>
+    <w:lvl w:ilvl="6" w:tentative="1">
+      <w:start w:val="1"/>
+      <w:numFmt w:val="bullet"/>
+      <w:lvlText w:val=""/>
+      <w:lvlJc w:val="left"/>
+      <w:pPr>
+        <w:tabs>
+          <w:tab w:val="num" w:pos="5040"/>
+        </w:tabs>
+        <w:ind w:left="5040" w:hanging="360"/>
+      </w:pPr>
+      <w:rPr>
+        <w:rFonts w:ascii="Wingdings" w:hAnsi="Wingdings" w:hint="default"/>
+        <w:sz w:val="20"/>
+      </w:rPr>
+    </w:lvl>
+    <w:lvl w:ilvl="7" w:tentative="1">
+      <w:start w:val="1"/>
+      <w:numFmt w:val="bullet"/>
+      <w:lvlText w:val=""/>
+      <w:lvlJc w:val="left"/>
+      <w:pPr>
+        <w:tabs>
+          <w:tab w:val="num" w:pos="5760"/>
+        </w:tabs>
+        <w:ind w:left="5760" w:hanging="360"/>
+      </w:pPr>
+      <w:rPr>
+        <w:rFonts w:ascii="Wingdings" w:hAnsi="Wingdings" w:hint="default"/>
+        <w:sz w:val="20"/>
+      </w:rPr>
+    </w:lvl>
+    <w:lvl w:ilvl="8" w:tentative="1">
+      <w:start w:val="1"/>
+      <w:numFmt w:val="bullet"/>
+      <w:lvlText w:val=""/>
+      <w:lvlJc w:val="left"/>
+      <w:pPr>
+        <w:tabs>
+          <w:tab w:val="num" w:pos="6480"/>
+        </w:tabs>
+        <w:ind w:left="6480" w:hanging="360"/>
+      </w:pPr>
+      <w:rPr>
+        <w:rFonts w:ascii="Wingdings" w:hAnsi="Wingdings" w:hint="default"/>
+        <w:sz w:val="20"/>
+      </w:rPr>
+    </w:lvl>
+  </w:abstractNum>
   <w:num w:numId="1" w16cid:durableId="1464351618">
+    <w:abstractNumId w:val="1"/>
+  </w:num>
+  <w:num w:numId="2" w16cid:durableId="952324661">
+    <w:abstractNumId w:val="3"/>
+  </w:num>
+  <w:num w:numId="3" w16cid:durableId="1986812289">
+    <w:abstractNumId w:val="5"/>
+  </w:num>
+  <w:num w:numId="4" w16cid:durableId="1408763351">
     <w:abstractNumId w:val="0"/>
+  </w:num>
+  <w:num w:numId="5" w16cid:durableId="278921728">
+    <w:abstractNumId w:val="2"/>
+  </w:num>
+  <w:num w:numId="6" w16cid:durableId="1950046249">
+    <w:abstractNumId w:val="4"/>
   </w:num>
 </w:numbering>
 </file>
@@ -697,6 +2933,7 @@
   <w:style w:type="paragraph" w:default="1" w:styleId="Binhthng">
     <w:name w:val="Normal"/>
     <w:qFormat/>
+    <w:rsid w:val="00AC3825"/>
   </w:style>
   <w:style w:type="paragraph" w:styleId="u1">
     <w:name w:val="heading 1"/>
@@ -900,7 +3137,6 @@
   <w:style w:type="character" w:default="1" w:styleId="Phngmcinhcuaoanvn">
     <w:name w:val="Default Paragraph Font"/>
     <w:uiPriority w:val="1"/>
-    <w:semiHidden/>
     <w:unhideWhenUsed/>
   </w:style>
   <w:style w:type="table" w:default="1" w:styleId="BangThngthng">

</xml_diff>

<commit_message>
feat: more api part
</commit_message>
<xml_diff>
--- a/doc/Xedien.docx
+++ b/doc/Xedien.docx
@@ -431,6 +431,7 @@
         <w:rPr>
           <w:sz w:val="24"/>
           <w:szCs w:val="24"/>
+          <w:lang w:val="vi-VN"/>
         </w:rPr>
       </w:pPr>
       <w:r>
@@ -452,16 +453,15 @@
           <w:sz w:val="24"/>
           <w:szCs w:val="24"/>
         </w:rPr>
-        <w:t xml:space="preserve"> Chịu thêm phí phát sinh</w:t>
-      </w:r>
-    </w:p>
-    <w:p>
-      <w:pPr>
-        <w:rPr>
-          <w:sz w:val="24"/>
-          <w:szCs w:val="24"/>
-        </w:rPr>
-      </w:pPr>
+        <w:t xml:space="preserve"> Chịu thêm phí phát </w:t>
+      </w:r>
+      <w:r>
+        <w:rPr>
+          <w:sz w:val="24"/>
+          <w:szCs w:val="24"/>
+        </w:rPr>
+        <w:t>sinh</w:t>
+      </w:r>
     </w:p>
     <w:p>
       <w:pPr>
@@ -483,6 +483,16 @@
         <w:rPr>
           <w:sz w:val="24"/>
           <w:szCs w:val="24"/>
+          <w:lang w:val="vi-VN"/>
+        </w:rPr>
+      </w:pPr>
+    </w:p>
+    <w:p>
+      <w:pPr>
+        <w:rPr>
+          <w:sz w:val="24"/>
+          <w:szCs w:val="24"/>
+          <w:lang w:val="vi-VN"/>
         </w:rPr>
       </w:pPr>
     </w:p>
@@ -3137,6 +3147,7 @@
   <w:style w:type="character" w:default="1" w:styleId="Phngmcinhcuaoanvn">
     <w:name w:val="Default Paragraph Font"/>
     <w:uiPriority w:val="1"/>
+    <w:semiHidden/>
     <w:unhideWhenUsed/>
   </w:style>
   <w:style w:type="table" w:default="1" w:styleId="BangThngthng">

</xml_diff>

<commit_message>
feat: luong dat xe + notification
</commit_message>
<xml_diff>
--- a/doc/Xedien.docx
+++ b/doc/Xedien.docx
@@ -641,6 +641,7 @@
     <w:p>
       <w:pPr>
         <w:rPr>
+          <w:rFonts w:hint="eastAsia"/>
           <w:b/>
           <w:bCs/>
           <w:sz w:val="24"/>
@@ -678,7 +679,39 @@
           <w:lang w:val="vi-VN"/>
         </w:rPr>
         <w:br/>
-        <w:t>2.1, Tìm kiếm &amp; Đặt xe (Booking)</w:t>
+        <w:t xml:space="preserve">2.1, Tìm kiếm </w:t>
+      </w:r>
+      <w:r>
+        <w:rPr>
+          <w:rFonts w:hint="eastAsia"/>
+          <w:b/>
+          <w:bCs/>
+          <w:sz w:val="24"/>
+          <w:szCs w:val="24"/>
+          <w:lang w:val="vi-VN"/>
+        </w:rPr>
+        <w:t>và ch</w:t>
+      </w:r>
+      <w:r>
+        <w:rPr>
+          <w:b/>
+          <w:bCs/>
+          <w:sz w:val="24"/>
+          <w:szCs w:val="24"/>
+          <w:lang w:val="vi-VN"/>
+        </w:rPr>
+        <w:t>ọ</w:t>
+      </w:r>
+      <w:r>
+        <w:rPr>
+          <w:rFonts w:hint="eastAsia"/>
+          <w:b/>
+          <w:bCs/>
+          <w:sz w:val="24"/>
+          <w:szCs w:val="24"/>
+          <w:lang w:val="vi-VN"/>
+        </w:rPr>
+        <w:t>n xe</w:t>
       </w:r>
     </w:p>
     <w:p>
@@ -700,93 +733,884 @@
     </w:p>
     <w:p>
       <w:pPr>
+        <w:pStyle w:val="oancuaDanhsach"/>
         <w:numPr>
           <w:ilvl w:val="0"/>
-          <w:numId w:val="2"/>
+          <w:numId w:val="1"/>
         </w:numPr>
         <w:rPr>
           <w:sz w:val="24"/>
           <w:szCs w:val="24"/>
-        </w:rPr>
-      </w:pPr>
-      <w:r>
-        <w:rPr>
-          <w:b/>
-          <w:bCs/>
-          <w:sz w:val="24"/>
-          <w:szCs w:val="24"/>
-        </w:rPr>
-        <w:t>Tìm kiếm:</w:t>
-      </w:r>
-      <w:r>
-        <w:rPr>
-          <w:sz w:val="24"/>
-          <w:szCs w:val="24"/>
-        </w:rPr>
-        <w:t xml:space="preserve"> Khách nhập start_time, end_time và location_id.</w:t>
+          <w:lang w:val="vi-VN"/>
+        </w:rPr>
+      </w:pPr>
+      <w:r>
+        <w:rPr>
+          <w:sz w:val="24"/>
+          <w:szCs w:val="24"/>
+          <w:lang w:val="vi-VN"/>
+        </w:rPr>
+        <w:t xml:space="preserve">Tìm xe: </w:t>
+      </w:r>
+      <w:r>
+        <w:rPr>
+          <w:sz w:val="24"/>
+          <w:szCs w:val="24"/>
+          <w:lang w:val="vi-VN"/>
+        </w:rPr>
+        <w:t xml:space="preserve">Khách hàng có thể tìm xe trực tiếp qua các xe được giới thiệu theo phân khúc ở trang chủ hoặc trang danh sách các xe, có thể dùng bộ lọc và thanh tìm kiếm để chọn ra loại xe với giá tiền phù hợp. Hoặc, khách hàng có thể dùng </w:t>
+      </w:r>
+      <w:r>
+        <w:rPr>
+          <w:sz w:val="24"/>
+          <w:szCs w:val="24"/>
+          <w:lang w:val="vi-VN"/>
+        </w:rPr>
+        <w:t>bảng</w:t>
+      </w:r>
+      <w:r>
+        <w:rPr>
+          <w:sz w:val="24"/>
+          <w:szCs w:val="24"/>
+          <w:lang w:val="vi-VN"/>
+        </w:rPr>
+        <w:t xml:space="preserve"> </w:t>
+      </w:r>
+      <w:r>
+        <w:rPr>
+          <w:sz w:val="24"/>
+          <w:szCs w:val="24"/>
+          <w:lang w:val="vi-VN"/>
+        </w:rPr>
+        <w:t>“</w:t>
+      </w:r>
+      <w:r>
+        <w:rPr>
+          <w:sz w:val="24"/>
+          <w:szCs w:val="24"/>
+          <w:lang w:val="vi-VN"/>
+        </w:rPr>
+        <w:t xml:space="preserve">chọn </w:t>
+      </w:r>
+      <w:r>
+        <w:rPr>
+          <w:sz w:val="24"/>
+          <w:szCs w:val="24"/>
+          <w:lang w:val="vi-VN"/>
+        </w:rPr>
+        <w:t xml:space="preserve">xe nhanh” ở trang chủ, nhập </w:t>
+      </w:r>
+      <w:r>
+        <w:rPr>
+          <w:sz w:val="24"/>
+          <w:szCs w:val="24"/>
+          <w:lang w:val="vi-VN"/>
+        </w:rPr>
+        <w:t xml:space="preserve">thời gian muốn đặt và địa điểm của bản </w:t>
+      </w:r>
+      <w:r>
+        <w:rPr>
+          <w:sz w:val="24"/>
+          <w:szCs w:val="24"/>
+          <w:lang w:val="vi-VN"/>
+        </w:rPr>
+        <w:t xml:space="preserve">thân, hệ thống sẽ tự động lọc ra những xe phù hợp. </w:t>
+      </w:r>
+    </w:p>
+    <w:p>
+      <w:pPr>
+        <w:pStyle w:val="oancuaDanhsach"/>
+        <w:numPr>
+          <w:ilvl w:val="0"/>
+          <w:numId w:val="1"/>
+        </w:numPr>
+        <w:rPr>
+          <w:sz w:val="24"/>
+          <w:szCs w:val="24"/>
+          <w:lang w:val="vi-VN"/>
+        </w:rPr>
+      </w:pPr>
+      <w:r>
+        <w:rPr>
+          <w:sz w:val="24"/>
+          <w:szCs w:val="24"/>
+          <w:lang w:val="vi-VN"/>
+        </w:rPr>
+        <w:t>Xem xe: Khách hàng bấm vào từng loại xe mong muốn, có thể xem những thông số của xe (</w:t>
+      </w:r>
+      <w:r>
+        <w:rPr>
+          <w:sz w:val="24"/>
+          <w:szCs w:val="24"/>
+          <w:lang w:val="vi-VN"/>
+        </w:rPr>
+        <w:t>phạm vi, công suất, số chỗ, túi khí, pin</w:t>
+      </w:r>
+      <w:r>
+        <w:rPr>
+          <w:sz w:val="24"/>
+          <w:szCs w:val="24"/>
+          <w:lang w:val="vi-VN"/>
+        </w:rPr>
+        <w:t>…</w:t>
+      </w:r>
+      <w:r>
+        <w:rPr>
+          <w:sz w:val="24"/>
+          <w:szCs w:val="24"/>
+          <w:lang w:val="vi-VN"/>
+        </w:rPr>
+        <w:t xml:space="preserve">) , xem được những tính năng nổi bật và đặc biệt là những đánh giá của khách hàng đã thuê xe trước đó để thêm yên tâm về lựa chọn. </w:t>
+      </w:r>
+    </w:p>
+    <w:p>
+      <w:pPr>
+        <w:pStyle w:val="oancuaDanhsach"/>
+        <w:numPr>
+          <w:ilvl w:val="0"/>
+          <w:numId w:val="1"/>
+        </w:numPr>
+        <w:rPr>
+          <w:sz w:val="24"/>
+          <w:szCs w:val="24"/>
+          <w:lang w:val="vi-VN"/>
+        </w:rPr>
+      </w:pPr>
+      <w:r>
+        <w:rPr>
+          <w:sz w:val="24"/>
+          <w:szCs w:val="24"/>
+          <w:lang w:val="vi-VN"/>
+        </w:rPr>
+        <w:t>Chọn xe: Khách hàng đầu tiên sẽ nhập ngày giờ mình muốn thuê, chọn gói 4h, 8h hoặc 1 ngày, nếu muốn lâu hơn, khách hàng và chủ xe tự thương lượng với nhau. Sau đó chọn địa điểm giao nhận xe, có thể chọn “Tự đến lấy xe”, hệ thống có hiện map và vị trí cụ thể của xe, hoặc là chọn “</w:t>
+      </w:r>
+      <w:r>
+        <w:rPr>
+          <w:rFonts w:hint="eastAsia"/>
+          <w:sz w:val="24"/>
+          <w:szCs w:val="24"/>
+          <w:lang w:val="vi-VN"/>
+        </w:rPr>
+        <w:t>Giao xe t</w:t>
+      </w:r>
+      <w:r>
+        <w:rPr>
+          <w:sz w:val="24"/>
+          <w:szCs w:val="24"/>
+          <w:lang w:val="vi-VN"/>
+        </w:rPr>
+        <w:t>ậ</w:t>
+      </w:r>
+      <w:r>
+        <w:rPr>
+          <w:rFonts w:hint="eastAsia"/>
+          <w:sz w:val="24"/>
+          <w:szCs w:val="24"/>
+          <w:lang w:val="vi-VN"/>
+        </w:rPr>
+        <w:t>n n</w:t>
+      </w:r>
+      <w:r>
+        <w:rPr>
+          <w:rFonts w:ascii="Calibri" w:hAnsi="Calibri" w:cs="Calibri"/>
+          <w:sz w:val="24"/>
+          <w:szCs w:val="24"/>
+          <w:lang w:val="vi-VN"/>
+        </w:rPr>
+        <w:t>ơ</w:t>
+      </w:r>
+      <w:r>
+        <w:rPr>
+          <w:rFonts w:ascii="Calibri" w:hAnsi="Calibri" w:cs="Calibri" w:hint="eastAsia"/>
+          <w:sz w:val="24"/>
+          <w:szCs w:val="24"/>
+          <w:lang w:val="vi-VN"/>
+        </w:rPr>
+        <w:t>i</w:t>
+      </w:r>
+      <w:r>
+        <w:rPr>
+          <w:rFonts w:ascii="Calibri" w:hAnsi="Calibri" w:cs="Calibri"/>
+          <w:sz w:val="24"/>
+          <w:szCs w:val="24"/>
+          <w:lang w:val="vi-VN"/>
+        </w:rPr>
+        <w:t>”</w:t>
+      </w:r>
+      <w:r>
+        <w:rPr>
+          <w:rFonts w:ascii="Calibri" w:hAnsi="Calibri" w:cs="Calibri" w:hint="eastAsia"/>
+          <w:sz w:val="24"/>
+          <w:szCs w:val="24"/>
+          <w:lang w:val="vi-VN"/>
+        </w:rPr>
+        <w:t>, h</w:t>
+      </w:r>
+      <w:r>
+        <w:rPr>
+          <w:rFonts w:ascii="Calibri" w:hAnsi="Calibri" w:cs="Calibri"/>
+          <w:sz w:val="24"/>
+          <w:szCs w:val="24"/>
+          <w:lang w:val="vi-VN"/>
+        </w:rPr>
+        <w:t>ệ</w:t>
+      </w:r>
+      <w:r>
+        <w:rPr>
+          <w:rFonts w:ascii="Calibri" w:hAnsi="Calibri" w:cs="Calibri" w:hint="eastAsia"/>
+          <w:sz w:val="24"/>
+          <w:szCs w:val="24"/>
+          <w:lang w:val="vi-VN"/>
+        </w:rPr>
+        <w:t xml:space="preserve"> th</w:t>
+      </w:r>
+      <w:r>
+        <w:rPr>
+          <w:rFonts w:ascii="Calibri" w:hAnsi="Calibri" w:cs="Calibri"/>
+          <w:sz w:val="24"/>
+          <w:szCs w:val="24"/>
+          <w:lang w:val="vi-VN"/>
+        </w:rPr>
+        <w:t>ố</w:t>
+      </w:r>
+      <w:r>
+        <w:rPr>
+          <w:rFonts w:ascii="Calibri" w:hAnsi="Calibri" w:cs="Calibri" w:hint="eastAsia"/>
+          <w:sz w:val="24"/>
+          <w:szCs w:val="24"/>
+          <w:lang w:val="vi-VN"/>
+        </w:rPr>
+        <w:t>ng s</w:t>
+      </w:r>
+      <w:r>
+        <w:rPr>
+          <w:rFonts w:ascii="Calibri" w:hAnsi="Calibri" w:cs="Calibri"/>
+          <w:sz w:val="24"/>
+          <w:szCs w:val="24"/>
+          <w:lang w:val="vi-VN"/>
+        </w:rPr>
+        <w:t>ẽ</w:t>
+      </w:r>
+      <w:r>
+        <w:rPr>
+          <w:rFonts w:ascii="Calibri" w:hAnsi="Calibri" w:cs="Calibri" w:hint="eastAsia"/>
+          <w:sz w:val="24"/>
+          <w:szCs w:val="24"/>
+          <w:lang w:val="vi-VN"/>
+        </w:rPr>
+        <w:t xml:space="preserve"> cho khách nh</w:t>
+      </w:r>
+      <w:r>
+        <w:rPr>
+          <w:rFonts w:ascii="Calibri" w:hAnsi="Calibri" w:cs="Calibri"/>
+          <w:sz w:val="24"/>
+          <w:szCs w:val="24"/>
+          <w:lang w:val="vi-VN"/>
+        </w:rPr>
+        <w:t>ậ</w:t>
+      </w:r>
+      <w:r>
+        <w:rPr>
+          <w:rFonts w:ascii="Calibri" w:hAnsi="Calibri" w:cs="Calibri" w:hint="eastAsia"/>
+          <w:sz w:val="24"/>
+          <w:szCs w:val="24"/>
+          <w:lang w:val="vi-VN"/>
+        </w:rPr>
+        <w:t>p v</w:t>
+      </w:r>
+      <w:r>
+        <w:rPr>
+          <w:rFonts w:ascii="Calibri" w:hAnsi="Calibri" w:cs="Calibri"/>
+          <w:sz w:val="24"/>
+          <w:szCs w:val="24"/>
+          <w:lang w:val="vi-VN"/>
+        </w:rPr>
+        <w:t>ị</w:t>
+      </w:r>
+      <w:r>
+        <w:rPr>
+          <w:rFonts w:ascii="Calibri" w:hAnsi="Calibri" w:cs="Calibri" w:hint="eastAsia"/>
+          <w:sz w:val="24"/>
+          <w:szCs w:val="24"/>
+          <w:lang w:val="vi-VN"/>
+        </w:rPr>
+        <w:t xml:space="preserve"> trí mong mu</w:t>
+      </w:r>
+      <w:r>
+        <w:rPr>
+          <w:rFonts w:ascii="Calibri" w:hAnsi="Calibri" w:cs="Calibri"/>
+          <w:sz w:val="24"/>
+          <w:szCs w:val="24"/>
+          <w:lang w:val="vi-VN"/>
+        </w:rPr>
+        <w:t>ố</w:t>
+      </w:r>
+      <w:r>
+        <w:rPr>
+          <w:rFonts w:ascii="Calibri" w:hAnsi="Calibri" w:cs="Calibri" w:hint="eastAsia"/>
+          <w:sz w:val="24"/>
+          <w:szCs w:val="24"/>
+          <w:lang w:val="vi-VN"/>
+        </w:rPr>
+        <w:t>n c</w:t>
+      </w:r>
+      <w:r>
+        <w:rPr>
+          <w:rFonts w:ascii="Calibri" w:hAnsi="Calibri" w:cs="Calibri"/>
+          <w:sz w:val="24"/>
+          <w:szCs w:val="24"/>
+          <w:lang w:val="vi-VN"/>
+        </w:rPr>
+        <w:t>ủ</w:t>
+      </w:r>
+      <w:r>
+        <w:rPr>
+          <w:rFonts w:ascii="Calibri" w:hAnsi="Calibri" w:cs="Calibri" w:hint="eastAsia"/>
+          <w:sz w:val="24"/>
+          <w:szCs w:val="24"/>
+          <w:lang w:val="vi-VN"/>
+        </w:rPr>
+        <w:t>a b</w:t>
+      </w:r>
+      <w:r>
+        <w:rPr>
+          <w:rFonts w:ascii="Calibri" w:hAnsi="Calibri" w:cs="Calibri"/>
+          <w:sz w:val="24"/>
+          <w:szCs w:val="24"/>
+          <w:lang w:val="vi-VN"/>
+        </w:rPr>
+        <w:t>ả</w:t>
+      </w:r>
+      <w:r>
+        <w:rPr>
+          <w:rFonts w:ascii="Calibri" w:hAnsi="Calibri" w:cs="Calibri" w:hint="eastAsia"/>
+          <w:sz w:val="24"/>
+          <w:szCs w:val="24"/>
+          <w:lang w:val="vi-VN"/>
+        </w:rPr>
+        <w:t>n thân và tính thêm phí sau m</w:t>
+      </w:r>
+      <w:r>
+        <w:rPr>
+          <w:rFonts w:ascii="Calibri" w:hAnsi="Calibri" w:cs="Calibri"/>
+          <w:sz w:val="24"/>
+          <w:szCs w:val="24"/>
+          <w:lang w:val="vi-VN"/>
+        </w:rPr>
+        <w:t>ỗ</w:t>
+      </w:r>
+      <w:r>
+        <w:rPr>
+          <w:rFonts w:ascii="Calibri" w:hAnsi="Calibri" w:cs="Calibri" w:hint="eastAsia"/>
+          <w:sz w:val="24"/>
+          <w:szCs w:val="24"/>
+          <w:lang w:val="vi-VN"/>
+        </w:rPr>
+        <w:t>i km, xe s</w:t>
+      </w:r>
+      <w:r>
+        <w:rPr>
+          <w:rFonts w:ascii="Calibri" w:hAnsi="Calibri" w:cs="Calibri"/>
+          <w:sz w:val="24"/>
+          <w:szCs w:val="24"/>
+          <w:lang w:val="vi-VN"/>
+        </w:rPr>
+        <w:t>ẽ</w:t>
+      </w:r>
+      <w:r>
+        <w:rPr>
+          <w:rFonts w:ascii="Calibri" w:hAnsi="Calibri" w:cs="Calibri" w:hint="eastAsia"/>
+          <w:sz w:val="24"/>
+          <w:szCs w:val="24"/>
+          <w:lang w:val="vi-VN"/>
+        </w:rPr>
+        <w:t xml:space="preserve"> đ</w:t>
+      </w:r>
+      <w:r>
+        <w:rPr>
+          <w:rFonts w:ascii="Calibri" w:hAnsi="Calibri" w:cs="Calibri"/>
+          <w:sz w:val="24"/>
+          <w:szCs w:val="24"/>
+          <w:lang w:val="vi-VN"/>
+        </w:rPr>
+        <w:t>ượ</w:t>
+      </w:r>
+      <w:r>
+        <w:rPr>
+          <w:rFonts w:ascii="Calibri" w:hAnsi="Calibri" w:cs="Calibri" w:hint="eastAsia"/>
+          <w:sz w:val="24"/>
+          <w:szCs w:val="24"/>
+          <w:lang w:val="vi-VN"/>
+        </w:rPr>
+        <w:t>c giao t</w:t>
+      </w:r>
+      <w:r>
+        <w:rPr>
+          <w:rFonts w:ascii="Calibri" w:hAnsi="Calibri" w:cs="Calibri"/>
+          <w:sz w:val="24"/>
+          <w:szCs w:val="24"/>
+          <w:lang w:val="vi-VN"/>
+        </w:rPr>
+        <w:t>ậ</w:t>
+      </w:r>
+      <w:r>
+        <w:rPr>
+          <w:rFonts w:ascii="Calibri" w:hAnsi="Calibri" w:cs="Calibri" w:hint="eastAsia"/>
+          <w:sz w:val="24"/>
+          <w:szCs w:val="24"/>
+          <w:lang w:val="vi-VN"/>
+        </w:rPr>
+        <w:t>n n</w:t>
+      </w:r>
+      <w:r>
+        <w:rPr>
+          <w:rFonts w:ascii="Calibri" w:hAnsi="Calibri" w:cs="Calibri"/>
+          <w:sz w:val="24"/>
+          <w:szCs w:val="24"/>
+          <w:lang w:val="vi-VN"/>
+        </w:rPr>
+        <w:t>ơ</w:t>
+      </w:r>
+      <w:r>
+        <w:rPr>
+          <w:rFonts w:ascii="Calibri" w:hAnsi="Calibri" w:cs="Calibri" w:hint="eastAsia"/>
+          <w:sz w:val="24"/>
+          <w:szCs w:val="24"/>
+          <w:lang w:val="vi-VN"/>
+        </w:rPr>
+        <w:t xml:space="preserve">i. </w:t>
+      </w:r>
+    </w:p>
+    <w:p>
+      <w:pPr>
+        <w:rPr>
+          <w:rFonts w:hint="eastAsia"/>
+          <w:b/>
+          <w:bCs/>
+          <w:sz w:val="24"/>
+          <w:szCs w:val="24"/>
+        </w:rPr>
+      </w:pPr>
+      <w:r>
+        <w:rPr>
+          <w:b/>
+          <w:bCs/>
+          <w:sz w:val="24"/>
+          <w:szCs w:val="24"/>
+        </w:rPr>
+        <w:t>2.</w:t>
+      </w:r>
+      <w:r>
+        <w:rPr>
+          <w:b/>
+          <w:bCs/>
+          <w:sz w:val="24"/>
+          <w:szCs w:val="24"/>
+        </w:rPr>
+        <w:t>2,</w:t>
+      </w:r>
+      <w:r>
+        <w:rPr>
+          <w:b/>
+          <w:bCs/>
+          <w:sz w:val="24"/>
+          <w:szCs w:val="24"/>
+        </w:rPr>
+        <w:t xml:space="preserve"> </w:t>
+      </w:r>
+      <w:r>
+        <w:rPr>
+          <w:rFonts w:hint="eastAsia"/>
+          <w:b/>
+          <w:bCs/>
+          <w:sz w:val="24"/>
+          <w:szCs w:val="24"/>
+        </w:rPr>
+        <w:t>Đ</w:t>
+      </w:r>
+      <w:r>
+        <w:rPr>
+          <w:b/>
+          <w:bCs/>
+          <w:sz w:val="24"/>
+          <w:szCs w:val="24"/>
+        </w:rPr>
+        <w:t>ặ</w:t>
+      </w:r>
+      <w:r>
+        <w:rPr>
+          <w:rFonts w:hint="eastAsia"/>
+          <w:b/>
+          <w:bCs/>
+          <w:sz w:val="24"/>
+          <w:szCs w:val="24"/>
+        </w:rPr>
+        <w:t>t xe</w:t>
+      </w:r>
+    </w:p>
+    <w:p>
+      <w:pPr>
+        <w:rPr>
+          <w:sz w:val="24"/>
+          <w:szCs w:val="24"/>
+        </w:rPr>
+      </w:pPr>
+      <w:r>
+        <w:rPr>
+          <w:rFonts w:hint="eastAsia"/>
+          <w:sz w:val="24"/>
+          <w:szCs w:val="24"/>
+        </w:rPr>
+        <w:t>Sau khi khách hàng b</w:t>
+      </w:r>
+      <w:r>
+        <w:rPr>
+          <w:sz w:val="24"/>
+          <w:szCs w:val="24"/>
+        </w:rPr>
+        <w:t>ấ</w:t>
+      </w:r>
+      <w:r>
+        <w:rPr>
+          <w:rFonts w:hint="eastAsia"/>
+          <w:sz w:val="24"/>
+          <w:szCs w:val="24"/>
+        </w:rPr>
+        <w:t xml:space="preserve">m </w:t>
+      </w:r>
+      <w:r>
+        <w:rPr>
+          <w:sz w:val="24"/>
+          <w:szCs w:val="24"/>
+        </w:rPr>
+        <w:t>“Chọn thuê”, hệ thống sẽ chuyển đến trang checkout.</w:t>
+      </w:r>
+    </w:p>
+    <w:p>
+      <w:pPr>
+        <w:pStyle w:val="oancuaDanhsach"/>
+        <w:numPr>
+          <w:ilvl w:val="0"/>
+          <w:numId w:val="1"/>
+        </w:numPr>
+        <w:rPr>
+          <w:sz w:val="24"/>
+          <w:szCs w:val="24"/>
+        </w:rPr>
+      </w:pPr>
+      <w:r>
+        <w:rPr>
+          <w:sz w:val="24"/>
+          <w:szCs w:val="24"/>
+        </w:rPr>
+        <w:t xml:space="preserve">B1: Khách hàng sẽ kiếm tra lại thông tin liên lạc của bản thân, nếu là tài khoản “Guest” khách hàng sẽ phải đăng nhập để thực hiện các bước tiếp theo. Kiểm tra lại thời điểm giao nhận xe, kiểm tra phí thuê xe đã bao gồm các loại phí dịch vụ. Hơn nữa, khách hàng có thể nhập “Lời nhắn cho chủ xe” để sau khi gửi yêu cầu, khách hàng và chủ xe có thể nhắn tin trực tiếp với nhau để bàn thêm về xe. </w:t>
+      </w:r>
+    </w:p>
+    <w:p>
+      <w:pPr>
+        <w:pStyle w:val="oancuaDanhsach"/>
+        <w:numPr>
+          <w:ilvl w:val="0"/>
+          <w:numId w:val="1"/>
+        </w:numPr>
+        <w:rPr>
+          <w:sz w:val="24"/>
+          <w:szCs w:val="24"/>
+        </w:rPr>
+      </w:pPr>
+      <w:r>
+        <w:rPr>
+          <w:sz w:val="24"/>
+          <w:szCs w:val="24"/>
+        </w:rPr>
+        <w:t>B2: Khách hàng đến với bước thanh toán, khách hàng cần cọc trước 30% số tiền qua hệ thống.</w:t>
+      </w:r>
+    </w:p>
+    <w:p>
+      <w:pPr>
+        <w:ind w:left="360"/>
+        <w:rPr>
+          <w:sz w:val="24"/>
+          <w:szCs w:val="24"/>
+        </w:rPr>
+      </w:pPr>
+      <w:r>
+        <w:rPr>
+          <w:sz w:val="24"/>
+          <w:szCs w:val="24"/>
+        </w:rPr>
+        <w:t xml:space="preserve">Ở đây, hệ thống sử dụng mô hình Tạm giữ tiền (Escrow – Pre-pay) hoạt động như một khoản bảo chứng tài chính. </w:t>
+      </w:r>
+      <w:r>
+        <w:rPr>
+          <w:sz w:val="24"/>
+          <w:szCs w:val="24"/>
+        </w:rPr>
+        <w:t xml:space="preserve">Thay vì trừ thẳng vào tài khoản, hệ thống chỉ </w:t>
+      </w:r>
+      <w:r>
+        <w:rPr>
+          <w:b/>
+          <w:bCs/>
+          <w:sz w:val="24"/>
+          <w:szCs w:val="24"/>
+        </w:rPr>
+        <w:t>phong tỏa (hold)</w:t>
+      </w:r>
+      <w:r>
+        <w:rPr>
+          <w:sz w:val="24"/>
+          <w:szCs w:val="24"/>
+        </w:rPr>
+        <w:t xml:space="preserve"> hạn mức thẻ tín dụng của bạn hoặc giữ tiền cọc để đảm bảo bạn sẽ thanh toán đúng hạn và đền bù nếu có phát sinh. </w:t>
+      </w:r>
+    </w:p>
+    <w:p>
+      <w:pPr>
+        <w:ind w:left="360"/>
+        <w:rPr>
+          <w:sz w:val="24"/>
+          <w:szCs w:val="24"/>
+        </w:rPr>
+      </w:pPr>
+      <w:r>
+        <w:rPr>
+          <w:sz w:val="24"/>
+          <w:szCs w:val="24"/>
+        </w:rPr>
+        <w:t>(</w:t>
+      </w:r>
+      <w:r>
+        <w:rPr>
+          <w:sz w:val="24"/>
+          <w:szCs w:val="24"/>
+        </w:rPr>
+        <w:t>Quy trình này hoạt động qua các bước rõ ràng sau:</w:t>
+      </w:r>
+    </w:p>
+    <w:p>
+      <w:pPr>
+        <w:ind w:left="1440"/>
+        <w:rPr>
+          <w:sz w:val="24"/>
+          <w:szCs w:val="24"/>
+        </w:rPr>
+      </w:pPr>
+      <w:r>
+        <w:rPr>
+          <w:b/>
+          <w:bCs/>
+          <w:sz w:val="24"/>
+          <w:szCs w:val="24"/>
+        </w:rPr>
+        <w:t>Bước 1 - Yêu cầu ký quỹ (Authorization/Hold):</w:t>
+      </w:r>
+      <w:r>
+        <w:rPr>
+          <w:sz w:val="24"/>
+          <w:szCs w:val="24"/>
+        </w:rPr>
+        <w:t xml:space="preserve"> Khi bạn đặt xe (</w:t>
+      </w:r>
+      <w:proofErr w:type="gramStart"/>
+      <w:r>
+        <w:rPr>
+          <w:sz w:val="24"/>
+          <w:szCs w:val="24"/>
+        </w:rPr>
+        <w:t>Pre-pay</w:t>
+      </w:r>
+      <w:proofErr w:type="gramEnd"/>
+      <w:r>
+        <w:rPr>
+          <w:sz w:val="24"/>
+          <w:szCs w:val="24"/>
+        </w:rPr>
+        <w:t xml:space="preserve">), hệ thống của bên cung cấp dịch vụ thuê xe sẽ yêu cầu ngân hàng của bạn phong tỏa một số tiền nhất định (thường bao gồm phí thuê xe trước và tiền cọc trách nhiệm). Số tiền này bị trừ khỏi hạn mức tín dụng nhưng chưa thực sự chuyển cho công ty. </w:t>
+      </w:r>
+    </w:p>
+    <w:p>
+      <w:pPr>
+        <w:ind w:left="1440"/>
+        <w:rPr>
+          <w:sz w:val="24"/>
+          <w:szCs w:val="24"/>
+        </w:rPr>
+      </w:pPr>
+      <w:r>
+        <w:rPr>
+          <w:b/>
+          <w:bCs/>
+          <w:sz w:val="24"/>
+          <w:szCs w:val="24"/>
+        </w:rPr>
+        <w:lastRenderedPageBreak/>
+        <w:t>Bước 2 - Kiểm tra tình trạng xe (Check-in/Check-out):</w:t>
+      </w:r>
+      <w:r>
+        <w:rPr>
+          <w:sz w:val="24"/>
+          <w:szCs w:val="24"/>
+        </w:rPr>
+        <w:t xml:space="preserve"> Trước khi nhận và sau khi trả xe, bạn và đại diện công ty (hoặc hệ thống ứng dụng) sẽ cùng kiểm tra tình trạng, mức nhiên liệu và số km thực tế.</w:t>
+      </w:r>
+    </w:p>
+    <w:p>
+      <w:pPr>
+        <w:ind w:left="1440"/>
+        <w:rPr>
+          <w:sz w:val="24"/>
+          <w:szCs w:val="24"/>
+        </w:rPr>
+      </w:pPr>
+      <w:r>
+        <w:rPr>
+          <w:b/>
+          <w:bCs/>
+          <w:sz w:val="24"/>
+          <w:szCs w:val="24"/>
+        </w:rPr>
+        <w:t>Bước 3 - Giải quyết phát sinh (Nếu có):</w:t>
       </w:r>
     </w:p>
     <w:p>
       <w:pPr>
         <w:numPr>
           <w:ilvl w:val="1"/>
-          <w:numId w:val="2"/>
+          <w:numId w:val="7"/>
         </w:numPr>
-        <w:rPr>
-          <w:sz w:val="24"/>
-          <w:szCs w:val="24"/>
-        </w:rPr>
-      </w:pPr>
-      <w:r>
-        <w:rPr>
-          <w:b/>
-          <w:bCs/>
-          <w:sz w:val="24"/>
-          <w:szCs w:val="24"/>
-        </w:rPr>
-        <w:t>Logic:</w:t>
-      </w:r>
-      <w:r>
-        <w:rPr>
-          <w:sz w:val="24"/>
-          <w:szCs w:val="24"/>
-        </w:rPr>
-        <w:t xml:space="preserve"> Hệ thống lọc trong bảng vehicles những xe có status = 'available'.</w:t>
+        <w:tabs>
+          <w:tab w:val="clear" w:pos="1440"/>
+          <w:tab w:val="num" w:pos="2160"/>
+        </w:tabs>
+        <w:ind w:left="2160"/>
+        <w:rPr>
+          <w:sz w:val="24"/>
+          <w:szCs w:val="24"/>
+        </w:rPr>
+      </w:pPr>
+      <w:r>
+        <w:rPr>
+          <w:i/>
+          <w:iCs/>
+          <w:sz w:val="24"/>
+          <w:szCs w:val="24"/>
+        </w:rPr>
+        <w:t>Nếu xe nguyên vẹn:</w:t>
+      </w:r>
+      <w:r>
+        <w:rPr>
+          <w:sz w:val="24"/>
+          <w:szCs w:val="24"/>
+        </w:rPr>
+        <w:t xml:space="preserve"> Công ty hủy lệnh phong tỏa (Release hold). Tiền sẽ được trả lại hạn mức thẻ của bạn.</w:t>
       </w:r>
     </w:p>
     <w:p>
       <w:pPr>
         <w:numPr>
           <w:ilvl w:val="1"/>
-          <w:numId w:val="2"/>
+          <w:numId w:val="7"/>
         </w:numPr>
-        <w:rPr>
-          <w:sz w:val="24"/>
-          <w:szCs w:val="24"/>
-        </w:rPr>
-      </w:pPr>
-      <w:r>
-        <w:rPr>
-          <w:b/>
-          <w:bCs/>
-          <w:sz w:val="24"/>
-          <w:szCs w:val="24"/>
-        </w:rPr>
-        <w:t>Quan trọng:</w:t>
-      </w:r>
-      <w:r>
-        <w:rPr>
-          <w:sz w:val="24"/>
-          <w:szCs w:val="24"/>
-        </w:rPr>
-        <w:t xml:space="preserve"> Hệ thống phải kiểm tra bảng bookings để loại trừ các xe đã có lịch đặt chồng chéo trong khoảng thời gian đó (mặc dù hiện tại nó đang available nhưng tương lai có thể đã bị đặt).</w:t>
-      </w:r>
-    </w:p>
-    <w:p>
-      <w:pPr>
+        <w:tabs>
+          <w:tab w:val="clear" w:pos="1440"/>
+          <w:tab w:val="num" w:pos="2160"/>
+        </w:tabs>
+        <w:ind w:left="2160"/>
+        <w:rPr>
+          <w:sz w:val="24"/>
+          <w:szCs w:val="24"/>
+        </w:rPr>
+      </w:pPr>
+      <w:r>
+        <w:rPr>
+          <w:i/>
+          <w:iCs/>
+          <w:sz w:val="24"/>
+          <w:szCs w:val="24"/>
+        </w:rPr>
+        <w:t>Nếu có hư hỏng, phạt nguội, hoặc trả muộn:</w:t>
+      </w:r>
+      <w:r>
+        <w:rPr>
+          <w:sz w:val="24"/>
+          <w:szCs w:val="24"/>
+        </w:rPr>
+        <w:t xml:space="preserve"> Hệ thống sẽ cắt một phần tiền tương ứng từ khoản đã giữ. </w:t>
+      </w:r>
+    </w:p>
+    <w:p>
+      <w:pPr>
+        <w:ind w:left="1440"/>
+        <w:rPr>
+          <w:sz w:val="24"/>
+          <w:szCs w:val="24"/>
+        </w:rPr>
+      </w:pPr>
+      <w:r>
+        <w:rPr>
+          <w:b/>
+          <w:bCs/>
+          <w:sz w:val="24"/>
+          <w:szCs w:val="24"/>
+        </w:rPr>
+        <w:t>Bước 4 - Hoàn tất thanh toán:</w:t>
+      </w:r>
+      <w:r>
+        <w:rPr>
+          <w:sz w:val="24"/>
+          <w:szCs w:val="24"/>
+        </w:rPr>
+        <w:t xml:space="preserve"> Phần tiền thuê thực tế sẽ được thanh toán chính thức và phần cọc còn lại (nếu có) sẽ được giải phóng hoàn toàn.</w:t>
+      </w:r>
+    </w:p>
+    <w:p>
+      <w:pPr>
+        <w:ind w:left="1440"/>
+        <w:rPr>
+          <w:sz w:val="24"/>
+          <w:szCs w:val="24"/>
+        </w:rPr>
+      </w:pPr>
+      <w:r>
+        <w:rPr>
+          <w:b/>
+          <w:bCs/>
+          <w:sz w:val="24"/>
+          <w:szCs w:val="24"/>
+        </w:rPr>
+        <w:t>(LƯU Ý:</w:t>
+      </w:r>
+      <w:r>
+        <w:rPr>
+          <w:sz w:val="24"/>
+          <w:szCs w:val="24"/>
+        </w:rPr>
+        <w:t xml:space="preserve"> Chủ xe có thể từ chối nếu khách hàng không đảm bảo những yêu cầu chủ xe đặt ra, khi đó tiền sẽ tự động về lại tài khoản của</w:t>
+      </w:r>
+      <w:r>
+        <w:rPr>
+          <w:sz w:val="24"/>
+          <w:szCs w:val="24"/>
+        </w:rPr>
+        <w:t xml:space="preserve"> khách hàng hoặc tài khoản sẽ hết bị phong tỏa hạn mức</w:t>
+      </w:r>
+      <w:proofErr w:type="gramStart"/>
+      <w:r>
+        <w:rPr>
+          <w:sz w:val="24"/>
+          <w:szCs w:val="24"/>
+        </w:rPr>
+        <w:t>) )</w:t>
+      </w:r>
+      <w:proofErr w:type="gramEnd"/>
+    </w:p>
+    <w:p>
+      <w:pPr>
+        <w:pStyle w:val="oancuaDanhsach"/>
         <w:numPr>
           <w:ilvl w:val="0"/>
-          <w:numId w:val="2"/>
+          <w:numId w:val="1"/>
         </w:numPr>
         <w:rPr>
           <w:sz w:val="24"/>
@@ -795,76 +1619,71 @@
       </w:pPr>
       <w:r>
         <w:rPr>
-          <w:b/>
-          <w:bCs/>
-          <w:sz w:val="24"/>
-          <w:szCs w:val="24"/>
-        </w:rPr>
-        <w:t>Chọn gói &amp; Xem giá:</w:t>
-      </w:r>
-      <w:r>
-        <w:rPr>
-          <w:sz w:val="24"/>
-          <w:szCs w:val="24"/>
-        </w:rPr>
-        <w:t xml:space="preserve"> Khách chọn mẫu xe (vehicle_model) và gói thuê (rental_plan).</w:t>
-      </w:r>
-    </w:p>
-    <w:p>
-      <w:pPr>
-        <w:numPr>
-          <w:ilvl w:val="1"/>
-          <w:numId w:val="2"/>
-        </w:numPr>
-        <w:rPr>
-          <w:sz w:val="24"/>
-          <w:szCs w:val="24"/>
-        </w:rPr>
-      </w:pPr>
-      <w:r>
-        <w:rPr>
-          <w:b/>
-          <w:bCs/>
-          <w:sz w:val="24"/>
-          <w:szCs w:val="24"/>
-        </w:rPr>
-        <w:t>Logic:</w:t>
-      </w:r>
-      <w:r>
-        <w:rPr>
-          <w:sz w:val="24"/>
-          <w:szCs w:val="24"/>
-        </w:rPr>
-        <w:t xml:space="preserve"> Truy vấn bảng pricing dựa trên vehicle_model_id và rental_plan_id để hiển thị giá dự kiến.</w:t>
-      </w:r>
-    </w:p>
-    <w:p>
-      <w:pPr>
-        <w:numPr>
-          <w:ilvl w:val="0"/>
-          <w:numId w:val="2"/>
-        </w:numPr>
-        <w:rPr>
-          <w:sz w:val="24"/>
-          <w:szCs w:val="24"/>
-        </w:rPr>
-      </w:pPr>
-      <w:r>
-        <w:rPr>
-          <w:b/>
-          <w:bCs/>
-          <w:sz w:val="24"/>
-          <w:szCs w:val="24"/>
-        </w:rPr>
-        <w:t>Tạo Booking:</w:t>
-      </w:r>
-      <w:r>
-        <w:rPr>
-          <w:sz w:val="24"/>
-          <w:szCs w:val="24"/>
-        </w:rPr>
-        <w:t xml:space="preserve"> Khi khách nhấn "Đặt xe", một bản ghi mới được tạo trong bảng bookings với status = 'pending'.</w:t>
-      </w:r>
+          <w:sz w:val="24"/>
+          <w:szCs w:val="24"/>
+        </w:rPr>
+        <w:t xml:space="preserve">B3: Sau khi thanh toán xong, màn hình sẽ hiện là thanh toán thành công, đơn của bạn sẽ được gửi cho chủ xe xác nhận và đến những bước tiếp theo. </w:t>
+      </w:r>
+    </w:p>
+    <w:p>
+      <w:pPr>
+        <w:ind w:left="360"/>
+        <w:rPr>
+          <w:sz w:val="24"/>
+          <w:szCs w:val="24"/>
+        </w:rPr>
+      </w:pPr>
+    </w:p>
+    <w:p>
+      <w:pPr>
+        <w:rPr>
+          <w:b/>
+          <w:bCs/>
+          <w:sz w:val="24"/>
+          <w:szCs w:val="24"/>
+        </w:rPr>
+      </w:pPr>
+      <w:r>
+        <w:rPr>
+          <w:b/>
+          <w:bCs/>
+          <w:sz w:val="24"/>
+          <w:szCs w:val="24"/>
+        </w:rPr>
+        <w:t xml:space="preserve">2.3, </w:t>
+      </w:r>
+      <w:r>
+        <w:rPr>
+          <w:b/>
+          <w:bCs/>
+          <w:sz w:val="24"/>
+          <w:szCs w:val="24"/>
+        </w:rPr>
+        <w:t>Nhận xe (Pick-up)</w:t>
+      </w:r>
+    </w:p>
+    <w:p>
+      <w:pPr>
+        <w:rPr>
+          <w:sz w:val="24"/>
+          <w:szCs w:val="24"/>
+        </w:rPr>
+      </w:pPr>
+      <w:r>
+        <w:rPr>
+          <w:sz w:val="24"/>
+          <w:szCs w:val="24"/>
+        </w:rPr>
+        <w:t>Khi khách đến cửa hàng lấy xe.</w:t>
+      </w:r>
+    </w:p>
+    <w:p>
+      <w:pPr>
+        <w:rPr>
+          <w:sz w:val="24"/>
+          <w:szCs w:val="24"/>
+        </w:rPr>
+      </w:pPr>
     </w:p>
     <w:p>
       <w:pPr>
@@ -891,369 +1710,6 @@
           <w:sz w:val="24"/>
           <w:szCs w:val="24"/>
         </w:rPr>
-        <w:t>2,</w:t>
-      </w:r>
-      <w:r>
-        <w:rPr>
-          <w:b/>
-          <w:bCs/>
-          <w:sz w:val="24"/>
-          <w:szCs w:val="24"/>
-        </w:rPr>
-        <w:t xml:space="preserve"> Xác nhận &amp; Thanh toán cọc (Payment)</w:t>
-      </w:r>
-    </w:p>
-    <w:p>
-      <w:pPr>
-        <w:rPr>
-          <w:sz w:val="24"/>
-          <w:szCs w:val="24"/>
-        </w:rPr>
-      </w:pPr>
-      <w:r>
-        <w:rPr>
-          <w:sz w:val="24"/>
-          <w:szCs w:val="24"/>
-        </w:rPr>
-        <w:t>Để đảm bảo khách không "đặt ảo", quy trình thường yêu cầu đặt cọc.</w:t>
-      </w:r>
-    </w:p>
-    <w:p>
-      <w:pPr>
-        <w:numPr>
-          <w:ilvl w:val="0"/>
-          <w:numId w:val="3"/>
-        </w:numPr>
-        <w:rPr>
-          <w:sz w:val="24"/>
-          <w:szCs w:val="24"/>
-        </w:rPr>
-      </w:pPr>
-      <w:r>
-        <w:rPr>
-          <w:b/>
-          <w:bCs/>
-          <w:sz w:val="24"/>
-          <w:szCs w:val="24"/>
-        </w:rPr>
-        <w:t>Thanh toán:</w:t>
-      </w:r>
-      <w:r>
-        <w:rPr>
-          <w:sz w:val="24"/>
-          <w:szCs w:val="24"/>
-        </w:rPr>
-        <w:t xml:space="preserve"> Hệ thống tạo bản ghi trong bảng payments.</w:t>
-      </w:r>
-    </w:p>
-    <w:p>
-      <w:pPr>
-        <w:numPr>
-          <w:ilvl w:val="0"/>
-          <w:numId w:val="3"/>
-        </w:numPr>
-        <w:rPr>
-          <w:sz w:val="24"/>
-          <w:szCs w:val="24"/>
-        </w:rPr>
-      </w:pPr>
-      <w:r>
-        <w:rPr>
-          <w:b/>
-          <w:bCs/>
-          <w:sz w:val="24"/>
-          <w:szCs w:val="24"/>
-        </w:rPr>
-        <w:t>Xác nhận:</w:t>
-      </w:r>
-      <w:r>
-        <w:rPr>
-          <w:sz w:val="24"/>
-          <w:szCs w:val="24"/>
-        </w:rPr>
-        <w:t xml:space="preserve"> Sau khi payment_status = 'paid', trạng thái </w:t>
-      </w:r>
-      <w:proofErr w:type="gramStart"/>
-      <w:r>
-        <w:rPr>
-          <w:sz w:val="24"/>
-          <w:szCs w:val="24"/>
-        </w:rPr>
-        <w:t>bookings.status</w:t>
-      </w:r>
-      <w:proofErr w:type="gramEnd"/>
-      <w:r>
-        <w:rPr>
-          <w:sz w:val="24"/>
-          <w:szCs w:val="24"/>
-        </w:rPr>
-        <w:t xml:space="preserve"> chuyển thành 'confirmed'.</w:t>
-      </w:r>
-    </w:p>
-    <w:p>
-      <w:pPr>
-        <w:numPr>
-          <w:ilvl w:val="0"/>
-          <w:numId w:val="3"/>
-        </w:numPr>
-        <w:rPr>
-          <w:sz w:val="24"/>
-          <w:szCs w:val="24"/>
-        </w:rPr>
-      </w:pPr>
-      <w:r>
-        <w:rPr>
-          <w:b/>
-          <w:bCs/>
-          <w:sz w:val="24"/>
-          <w:szCs w:val="24"/>
-        </w:rPr>
-        <w:t>Giữ xe:</w:t>
-      </w:r>
-      <w:r>
-        <w:rPr>
-          <w:sz w:val="24"/>
-          <w:szCs w:val="24"/>
-        </w:rPr>
-        <w:t xml:space="preserve"> Lúc này, chiếc xe đó sẽ không hiển thị cho người khác đặt trong khoảng thời gian đã chọn.</w:t>
-      </w:r>
-    </w:p>
-    <w:p>
-      <w:pPr>
-        <w:rPr>
-          <w:b/>
-          <w:bCs/>
-          <w:sz w:val="24"/>
-          <w:szCs w:val="24"/>
-        </w:rPr>
-      </w:pPr>
-      <w:r>
-        <w:rPr>
-          <w:b/>
-          <w:bCs/>
-          <w:sz w:val="24"/>
-          <w:szCs w:val="24"/>
-        </w:rPr>
-        <w:t xml:space="preserve">2.3, </w:t>
-      </w:r>
-      <w:r>
-        <w:rPr>
-          <w:b/>
-          <w:bCs/>
-          <w:sz w:val="24"/>
-          <w:szCs w:val="24"/>
-        </w:rPr>
-        <w:t>Nhận xe (Pick-up)</w:t>
-      </w:r>
-    </w:p>
-    <w:p>
-      <w:pPr>
-        <w:rPr>
-          <w:sz w:val="24"/>
-          <w:szCs w:val="24"/>
-        </w:rPr>
-      </w:pPr>
-      <w:r>
-        <w:rPr>
-          <w:sz w:val="24"/>
-          <w:szCs w:val="24"/>
-        </w:rPr>
-        <w:t>Khi khách đến cửa hàng lấy xe.</w:t>
-      </w:r>
-    </w:p>
-    <w:p>
-      <w:pPr>
-        <w:numPr>
-          <w:ilvl w:val="0"/>
-          <w:numId w:val="4"/>
-        </w:numPr>
-        <w:rPr>
-          <w:sz w:val="24"/>
-          <w:szCs w:val="24"/>
-        </w:rPr>
-      </w:pPr>
-      <w:r>
-        <w:rPr>
-          <w:b/>
-          <w:bCs/>
-          <w:sz w:val="24"/>
-          <w:szCs w:val="24"/>
-        </w:rPr>
-        <w:t>Kiểm tra hồ sơ:</w:t>
-      </w:r>
-      <w:r>
-        <w:rPr>
-          <w:sz w:val="24"/>
-          <w:szCs w:val="24"/>
-        </w:rPr>
-        <w:t xml:space="preserve"> Nhân viên kiểm tra license_no (bằng lái) đã lưu trong bảng users.</w:t>
-      </w:r>
-    </w:p>
-    <w:p>
-      <w:pPr>
-        <w:numPr>
-          <w:ilvl w:val="0"/>
-          <w:numId w:val="4"/>
-        </w:numPr>
-        <w:rPr>
-          <w:sz w:val="24"/>
-          <w:szCs w:val="24"/>
-        </w:rPr>
-      </w:pPr>
-      <w:r>
-        <w:rPr>
-          <w:b/>
-          <w:bCs/>
-          <w:sz w:val="24"/>
-          <w:szCs w:val="24"/>
-        </w:rPr>
-        <w:t>Bàn giao:</w:t>
-      </w:r>
-      <w:r>
-        <w:rPr>
-          <w:sz w:val="24"/>
-          <w:szCs w:val="24"/>
-        </w:rPr>
-        <w:t xml:space="preserve"> Nhân viên cập nhật:</w:t>
-      </w:r>
-    </w:p>
-    <w:p>
-      <w:pPr>
-        <w:numPr>
-          <w:ilvl w:val="1"/>
-          <w:numId w:val="4"/>
-        </w:numPr>
-        <w:rPr>
-          <w:sz w:val="24"/>
-          <w:szCs w:val="24"/>
-        </w:rPr>
-      </w:pPr>
-      <w:proofErr w:type="gramStart"/>
-      <w:r>
-        <w:rPr>
-          <w:sz w:val="24"/>
-          <w:szCs w:val="24"/>
-        </w:rPr>
-        <w:t>bookings.actual</w:t>
-      </w:r>
-      <w:proofErr w:type="gramEnd"/>
-      <w:r>
-        <w:rPr>
-          <w:sz w:val="24"/>
-          <w:szCs w:val="24"/>
-        </w:rPr>
-        <w:t>_start_time = CURRENT_TIMESTAMP.</w:t>
-      </w:r>
-    </w:p>
-    <w:p>
-      <w:pPr>
-        <w:numPr>
-          <w:ilvl w:val="1"/>
-          <w:numId w:val="4"/>
-        </w:numPr>
-        <w:rPr>
-          <w:sz w:val="24"/>
-          <w:szCs w:val="24"/>
-        </w:rPr>
-      </w:pPr>
-      <w:proofErr w:type="gramStart"/>
-      <w:r>
-        <w:rPr>
-          <w:sz w:val="24"/>
-          <w:szCs w:val="24"/>
-        </w:rPr>
-        <w:t>bookings.status</w:t>
-      </w:r>
-      <w:proofErr w:type="gramEnd"/>
-      <w:r>
-        <w:rPr>
-          <w:sz w:val="24"/>
-          <w:szCs w:val="24"/>
-        </w:rPr>
-        <w:t xml:space="preserve"> = 'picked_up'.</w:t>
-      </w:r>
-    </w:p>
-    <w:p>
-      <w:pPr>
-        <w:numPr>
-          <w:ilvl w:val="1"/>
-          <w:numId w:val="4"/>
-        </w:numPr>
-        <w:rPr>
-          <w:sz w:val="24"/>
-          <w:szCs w:val="24"/>
-        </w:rPr>
-      </w:pPr>
-      <w:proofErr w:type="gramStart"/>
-      <w:r>
-        <w:rPr>
-          <w:sz w:val="24"/>
-          <w:szCs w:val="24"/>
-        </w:rPr>
-        <w:t>vehicles.status</w:t>
-      </w:r>
-      <w:proofErr w:type="gramEnd"/>
-      <w:r>
-        <w:rPr>
-          <w:sz w:val="24"/>
-          <w:szCs w:val="24"/>
-        </w:rPr>
-        <w:t xml:space="preserve"> = 'rented'.</w:t>
-      </w:r>
-    </w:p>
-    <w:p>
-      <w:pPr>
-        <w:numPr>
-          <w:ilvl w:val="0"/>
-          <w:numId w:val="4"/>
-        </w:numPr>
-        <w:rPr>
-          <w:sz w:val="24"/>
-          <w:szCs w:val="24"/>
-        </w:rPr>
-      </w:pPr>
-      <w:r>
-        <w:rPr>
-          <w:b/>
-          <w:bCs/>
-          <w:sz w:val="24"/>
-          <w:szCs w:val="24"/>
-        </w:rPr>
-        <w:t>Ghi nhận trạng thái:</w:t>
-      </w:r>
-      <w:r>
-        <w:rPr>
-          <w:sz w:val="24"/>
-          <w:szCs w:val="24"/>
-        </w:rPr>
-        <w:t xml:space="preserve"> Ghi lại battery_level lúc giao xe để đối chiếu khi trả.</w:t>
-      </w:r>
-    </w:p>
-    <w:p>
-      <w:pPr>
-        <w:rPr>
-          <w:b/>
-          <w:bCs/>
-          <w:sz w:val="24"/>
-          <w:szCs w:val="24"/>
-        </w:rPr>
-      </w:pPr>
-      <w:r>
-        <w:rPr>
-          <w:b/>
-          <w:bCs/>
-          <w:sz w:val="24"/>
-          <w:szCs w:val="24"/>
-        </w:rPr>
-        <w:t>2.</w:t>
-      </w:r>
-      <w:r>
-        <w:rPr>
-          <w:b/>
-          <w:bCs/>
-          <w:sz w:val="24"/>
-          <w:szCs w:val="24"/>
-        </w:rPr>
         <w:t>4</w:t>
       </w:r>
       <w:r>
@@ -1287,7 +1743,6 @@
           <w:sz w:val="24"/>
           <w:szCs w:val="24"/>
         </w:rPr>
-        <w:lastRenderedPageBreak/>
         <w:t>Khách dùng xe và trả lại bãi.</w:t>
       </w:r>
     </w:p>
@@ -1526,6 +1981,7 @@
           <w:sz w:val="24"/>
           <w:szCs w:val="24"/>
         </w:rPr>
+        <w:lastRenderedPageBreak/>
         <w:t>Thanh toán nốt:</w:t>
       </w:r>
       <w:r>
@@ -2389,6 +2845,155 @@
       </w:rPr>
     </w:lvl>
     <w:lvl w:ilvl="1" w:tentative="1">
+      <w:start w:val="1"/>
+      <w:numFmt w:val="bullet"/>
+      <w:lvlText w:val="o"/>
+      <w:lvlJc w:val="left"/>
+      <w:pPr>
+        <w:tabs>
+          <w:tab w:val="num" w:pos="1440"/>
+        </w:tabs>
+        <w:ind w:left="1440" w:hanging="360"/>
+      </w:pPr>
+      <w:rPr>
+        <w:rFonts w:ascii="Courier New" w:hAnsi="Courier New" w:hint="default"/>
+        <w:sz w:val="20"/>
+      </w:rPr>
+    </w:lvl>
+    <w:lvl w:ilvl="2" w:tentative="1">
+      <w:start w:val="1"/>
+      <w:numFmt w:val="bullet"/>
+      <w:lvlText w:val=""/>
+      <w:lvlJc w:val="left"/>
+      <w:pPr>
+        <w:tabs>
+          <w:tab w:val="num" w:pos="2160"/>
+        </w:tabs>
+        <w:ind w:left="2160" w:hanging="360"/>
+      </w:pPr>
+      <w:rPr>
+        <w:rFonts w:ascii="Wingdings" w:hAnsi="Wingdings" w:hint="default"/>
+        <w:sz w:val="20"/>
+      </w:rPr>
+    </w:lvl>
+    <w:lvl w:ilvl="3" w:tentative="1">
+      <w:start w:val="1"/>
+      <w:numFmt w:val="bullet"/>
+      <w:lvlText w:val=""/>
+      <w:lvlJc w:val="left"/>
+      <w:pPr>
+        <w:tabs>
+          <w:tab w:val="num" w:pos="2880"/>
+        </w:tabs>
+        <w:ind w:left="2880" w:hanging="360"/>
+      </w:pPr>
+      <w:rPr>
+        <w:rFonts w:ascii="Wingdings" w:hAnsi="Wingdings" w:hint="default"/>
+        <w:sz w:val="20"/>
+      </w:rPr>
+    </w:lvl>
+    <w:lvl w:ilvl="4" w:tentative="1">
+      <w:start w:val="1"/>
+      <w:numFmt w:val="bullet"/>
+      <w:lvlText w:val=""/>
+      <w:lvlJc w:val="left"/>
+      <w:pPr>
+        <w:tabs>
+          <w:tab w:val="num" w:pos="3600"/>
+        </w:tabs>
+        <w:ind w:left="3600" w:hanging="360"/>
+      </w:pPr>
+      <w:rPr>
+        <w:rFonts w:ascii="Wingdings" w:hAnsi="Wingdings" w:hint="default"/>
+        <w:sz w:val="20"/>
+      </w:rPr>
+    </w:lvl>
+    <w:lvl w:ilvl="5" w:tentative="1">
+      <w:start w:val="1"/>
+      <w:numFmt w:val="bullet"/>
+      <w:lvlText w:val=""/>
+      <w:lvlJc w:val="left"/>
+      <w:pPr>
+        <w:tabs>
+          <w:tab w:val="num" w:pos="4320"/>
+        </w:tabs>
+        <w:ind w:left="4320" w:hanging="360"/>
+      </w:pPr>
+      <w:rPr>
+        <w:rFonts w:ascii="Wingdings" w:hAnsi="Wingdings" w:hint="default"/>
+        <w:sz w:val="20"/>
+      </w:rPr>
+    </w:lvl>
+    <w:lvl w:ilvl="6" w:tentative="1">
+      <w:start w:val="1"/>
+      <w:numFmt w:val="bullet"/>
+      <w:lvlText w:val=""/>
+      <w:lvlJc w:val="left"/>
+      <w:pPr>
+        <w:tabs>
+          <w:tab w:val="num" w:pos="5040"/>
+        </w:tabs>
+        <w:ind w:left="5040" w:hanging="360"/>
+      </w:pPr>
+      <w:rPr>
+        <w:rFonts w:ascii="Wingdings" w:hAnsi="Wingdings" w:hint="default"/>
+        <w:sz w:val="20"/>
+      </w:rPr>
+    </w:lvl>
+    <w:lvl w:ilvl="7" w:tentative="1">
+      <w:start w:val="1"/>
+      <w:numFmt w:val="bullet"/>
+      <w:lvlText w:val=""/>
+      <w:lvlJc w:val="left"/>
+      <w:pPr>
+        <w:tabs>
+          <w:tab w:val="num" w:pos="5760"/>
+        </w:tabs>
+        <w:ind w:left="5760" w:hanging="360"/>
+      </w:pPr>
+      <w:rPr>
+        <w:rFonts w:ascii="Wingdings" w:hAnsi="Wingdings" w:hint="default"/>
+        <w:sz w:val="20"/>
+      </w:rPr>
+    </w:lvl>
+    <w:lvl w:ilvl="8" w:tentative="1">
+      <w:start w:val="1"/>
+      <w:numFmt w:val="bullet"/>
+      <w:lvlText w:val=""/>
+      <w:lvlJc w:val="left"/>
+      <w:pPr>
+        <w:tabs>
+          <w:tab w:val="num" w:pos="6480"/>
+        </w:tabs>
+        <w:ind w:left="6480" w:hanging="360"/>
+      </w:pPr>
+      <w:rPr>
+        <w:rFonts w:ascii="Wingdings" w:hAnsi="Wingdings" w:hint="default"/>
+        <w:sz w:val="20"/>
+      </w:rPr>
+    </w:lvl>
+  </w:abstractNum>
+  <w:abstractNum w:abstractNumId="6" w15:restartNumberingAfterBreak="0">
+    <w:nsid w:val="7E666A67"/>
+    <w:multiLevelType w:val="multilevel"/>
+    <w:tmpl w:val="74708FDC"/>
+    <w:lvl w:ilvl="0">
+      <w:start w:val="1"/>
+      <w:numFmt w:val="bullet"/>
+      <w:lvlText w:val=""/>
+      <w:lvlJc w:val="left"/>
+      <w:pPr>
+        <w:tabs>
+          <w:tab w:val="num" w:pos="720"/>
+        </w:tabs>
+        <w:ind w:left="720" w:hanging="360"/>
+      </w:pPr>
+      <w:rPr>
+        <w:rFonts w:ascii="Symbol" w:hAnsi="Symbol" w:hint="default"/>
+        <w:sz w:val="20"/>
+      </w:rPr>
+    </w:lvl>
+    <w:lvl w:ilvl="1">
       <w:start w:val="1"/>
       <w:numFmt w:val="bullet"/>
       <w:lvlText w:val="o"/>
@@ -2534,6 +3139,9 @@
   </w:num>
   <w:num w:numId="6" w16cid:durableId="1950046249">
     <w:abstractNumId w:val="4"/>
+  </w:num>
+  <w:num w:numId="7" w16cid:durableId="1275792038">
+    <w:abstractNumId w:val="6"/>
   </w:num>
 </w:numbering>
 </file>
@@ -3142,7 +3750,6 @@
   <w:style w:type="character" w:default="1" w:styleId="Phngmcinhcuaoanvn">
     <w:name w:val="Default Paragraph Font"/>
     <w:uiPriority w:val="1"/>
-    <w:semiHidden/>
     <w:unhideWhenUsed/>
   </w:style>
   <w:style w:type="table" w:default="1" w:styleId="BangThngthng">
@@ -3456,6 +4063,29 @@
       <w:spacing w:val="5"/>
     </w:rPr>
   </w:style>
+  <w:style w:type="character" w:styleId="Siuktni">
+    <w:name w:val="Hyperlink"/>
+    <w:basedOn w:val="Phngmcinhcuaoanvn"/>
+    <w:uiPriority w:val="99"/>
+    <w:unhideWhenUsed/>
+    <w:rsid w:val="00927433"/>
+    <w:rPr>
+      <w:color w:val="0563C1" w:themeColor="hyperlink"/>
+      <w:u w:val="single"/>
+    </w:rPr>
+  </w:style>
+  <w:style w:type="character" w:styleId="cpChagiiquyt">
+    <w:name w:val="Unresolved Mention"/>
+    <w:basedOn w:val="Phngmcinhcuaoanvn"/>
+    <w:uiPriority w:val="99"/>
+    <w:semiHidden/>
+    <w:unhideWhenUsed/>
+    <w:rsid w:val="00927433"/>
+    <w:rPr>
+      <w:color w:val="605E5C"/>
+      <w:shd w:val="clear" w:color="auto" w:fill="E1DFDD"/>
+    </w:rPr>
+  </w:style>
 </w:styles>
 </file>
 

</xml_diff>

<commit_message>
fix: dashboard hien thi
</commit_message>
<xml_diff>
--- a/doc/Xedien.docx
+++ b/doc/Xedien.docx
@@ -1305,6 +1305,13 @@
         </w:rPr>
         <w:t xml:space="preserve">B1: Khách hàng sẽ kiếm tra lại thông tin liên lạc của bản thân, nếu là tài khoản “Guest” khách hàng sẽ phải đăng nhập để thực hiện các bước tiếp theo. Kiểm tra lại thời điểm giao nhận xe, kiểm tra phí thuê xe đã bao gồm các loại phí dịch vụ. Hơn nữa, khách hàng có thể nhập “Lời nhắn cho chủ xe” để sau khi gửi yêu cầu, khách hàng và chủ xe có thể nhắn tin trực tiếp với nhau để bàn thêm về xe. </w:t>
       </w:r>
+      <w:r>
+        <w:rPr>
+          <w:sz w:val="24"/>
+          <w:szCs w:val="24"/>
+        </w:rPr>
+        <w:t xml:space="preserve">Đối với những khách hàng muốn giao xe đến vị trí của bản thân, họ có thể thấy khoảng cách vị trí xe với vị trí bản thân trên bản đồ, tính tiền dựa trên khoảng cách rõ tường minh. </w:t>
+      </w:r>
     </w:p>
     <w:p>
       <w:pPr>
@@ -1426,7 +1433,15 @@
           <w:sz w:val="24"/>
           <w:szCs w:val="24"/>
         </w:rPr>
-        <w:t xml:space="preserve">), hệ thống của bên cung cấp dịch vụ thuê xe sẽ yêu cầu ngân hàng của bạn phong tỏa một số tiền nhất định (thường bao gồm phí thuê xe trước và tiền cọc trách nhiệm). Số tiền này bị trừ khỏi hạn mức tín dụng nhưng chưa thực sự chuyển cho công ty. </w:t>
+        <w:t xml:space="preserve">), hệ thống của bên cung cấp dịch vụ thuê xe sẽ yêu cầu ngân hàng của bạn phong tỏa một số tiền nhất định (thường bao gồm phí thuê xe trước và tiền cọc trách </w:t>
+      </w:r>
+      <w:r>
+        <w:rPr>
+          <w:sz w:val="24"/>
+          <w:szCs w:val="24"/>
+        </w:rPr>
+        <w:lastRenderedPageBreak/>
+        <w:t xml:space="preserve">nhiệm). Số tiền này bị trừ khỏi hạn mức tín dụng nhưng chưa thực sự chuyển cho công ty. </w:t>
       </w:r>
     </w:p>
     <w:p>
@@ -1444,7 +1459,6 @@
           <w:sz w:val="24"/>
           <w:szCs w:val="24"/>
         </w:rPr>
-        <w:lastRenderedPageBreak/>
         <w:t>Bước 2 - Kiểm tra tình trạng xe (Check-in/Check-out):</w:t>
       </w:r>
       <w:r>
@@ -1593,17 +1607,8 @@
           <w:sz w:val="24"/>
           <w:szCs w:val="24"/>
         </w:rPr>
-        <w:t xml:space="preserve"> khách hàng hoặc tài khoản sẽ hết bị phong tỏa hạn mức</w:t>
-      </w:r>
-      <w:proofErr w:type="gramStart"/>
-      <w:r>
-        <w:rPr>
-          <w:sz w:val="24"/>
-          <w:szCs w:val="24"/>
-        </w:rPr>
-        <w:t>) )</w:t>
-      </w:r>
-      <w:proofErr w:type="gramEnd"/>
+        <w:t xml:space="preserve"> khách hàng hoặc tài khoản sẽ hết bị phong tỏa hạn mức))</w:t>
+      </w:r>
     </w:p>
     <w:p>
       <w:pPr>
@@ -1674,7 +1679,50 @@
           <w:sz w:val="24"/>
           <w:szCs w:val="24"/>
         </w:rPr>
-        <w:t>Khi khách đến cửa hàng lấy xe.</w:t>
+        <w:t xml:space="preserve">Sau khi chủ xe xác nhận đơn, khách sẽ đợi đến ngày thuê xe, cho đến ngày đấy có thể nhắn thêm với chủ xe để hiểu hơn về </w:t>
+      </w:r>
+      <w:r>
+        <w:rPr>
+          <w:sz w:val="24"/>
+          <w:szCs w:val="24"/>
+        </w:rPr>
+        <w:t>xe và thông tin giá cả, dịch vụ, thuê-nhận xe, …</w:t>
+      </w:r>
+    </w:p>
+    <w:p>
+      <w:pPr>
+        <w:rPr>
+          <w:sz w:val="24"/>
+          <w:szCs w:val="24"/>
+        </w:rPr>
+      </w:pPr>
+      <w:r>
+        <w:rPr>
+          <w:sz w:val="24"/>
+          <w:szCs w:val="24"/>
+        </w:rPr>
+        <w:t xml:space="preserve">Đến ngày thuê xe, khách hàng được yêu cầu mang đầy đủ căn cước công dân, bằng lái xe đi để nhận xe. Khách hàng có thể kiểm tra xe xem có đúng mô tả không, </w:t>
+      </w:r>
+      <w:r>
+        <w:rPr>
+          <w:sz w:val="24"/>
+          <w:szCs w:val="24"/>
+        </w:rPr>
+        <w:t>… Còn chủ xe sẽ làm bước biên bản giao xe (gồm có: kiểm tra đối chiếu CCCD và GPLX, quay lại video, chụp ảnh xe,</w:t>
+      </w:r>
+      <w:r>
+        <w:rPr>
+          <w:sz w:val="24"/>
+          <w:szCs w:val="24"/>
+        </w:rPr>
+        <w:t xml:space="preserve"> </w:t>
+      </w:r>
+      <w:r>
+        <w:rPr>
+          <w:sz w:val="24"/>
+          <w:szCs w:val="24"/>
+        </w:rPr>
+        <w:t xml:space="preserve">…) để làm bằng chứng nếu xe có hư hại gì. Sau đó chấp nhận giao xe. </w:t>
       </w:r>
     </w:p>
     <w:p>
@@ -1830,6 +1878,7 @@
           <w:sz w:val="24"/>
           <w:szCs w:val="24"/>
         </w:rPr>
+        <w:lastRenderedPageBreak/>
         <w:t>Tính toán phí phát sinh:</w:t>
       </w:r>
     </w:p>
@@ -1981,7 +2030,6 @@
           <w:sz w:val="24"/>
           <w:szCs w:val="24"/>
         </w:rPr>
-        <w:lastRenderedPageBreak/>
         <w:t>Thanh toán nốt:</w:t>
       </w:r>
       <w:r>

</xml_diff>

<commit_message>
feat: thêm phân trang admin
</commit_message>
<xml_diff>
--- a/doc/Xedien.docx
+++ b/doc/Xedien.docx
@@ -641,20 +641,20 @@
     <w:p>
       <w:pPr>
         <w:rPr>
-          <w:rFonts w:hint="eastAsia"/>
-          <w:b/>
-          <w:bCs/>
-          <w:sz w:val="24"/>
-          <w:szCs w:val="24"/>
-          <w:lang w:val="vi-VN"/>
-        </w:rPr>
-      </w:pPr>
-      <w:r>
-        <w:rPr>
-          <w:b/>
-          <w:bCs/>
-          <w:sz w:val="34"/>
-          <w:szCs w:val="34"/>
+          <w:b/>
+          <w:bCs/>
+          <w:sz w:val="24"/>
+          <w:szCs w:val="24"/>
+          <w:lang w:val="vi-VN"/>
+        </w:rPr>
+      </w:pPr>
+      <w:r>
+        <w:rPr>
+          <w:rStyle w:val="u1Char"/>
+          <w:rFonts w:ascii="Calibri" w:hAnsi="Calibri" w:cs="Calibri"/>
+          <w:b/>
+          <w:bCs/>
+          <w:color w:val="auto"/>
           <w:lang w:val="vi-VN"/>
         </w:rPr>
         <w:lastRenderedPageBreak/>
@@ -1184,39 +1184,43 @@
     <w:p>
       <w:pPr>
         <w:rPr>
+          <w:b/>
+          <w:bCs/>
+          <w:sz w:val="24"/>
+          <w:szCs w:val="24"/>
+          <w:lang w:val="vi-VN"/>
+        </w:rPr>
+      </w:pPr>
+      <w:r>
+        <w:rPr>
+          <w:b/>
+          <w:bCs/>
+          <w:sz w:val="24"/>
+          <w:szCs w:val="24"/>
+          <w:lang w:val="vi-VN"/>
+        </w:rPr>
+        <w:t xml:space="preserve">2.2, </w:t>
+      </w:r>
+      <w:r>
+        <w:rPr>
           <w:rFonts w:hint="eastAsia"/>
           <w:b/>
           <w:bCs/>
           <w:sz w:val="24"/>
           <w:szCs w:val="24"/>
-        </w:rPr>
-      </w:pPr>
-      <w:r>
-        <w:rPr>
-          <w:b/>
-          <w:bCs/>
-          <w:sz w:val="24"/>
-          <w:szCs w:val="24"/>
-        </w:rPr>
-        <w:t>2.</w:t>
-      </w:r>
-      <w:r>
-        <w:rPr>
-          <w:b/>
-          <w:bCs/>
-          <w:sz w:val="24"/>
-          <w:szCs w:val="24"/>
-        </w:rPr>
-        <w:t>2,</w:t>
-      </w:r>
-      <w:r>
-        <w:rPr>
-          <w:b/>
-          <w:bCs/>
-          <w:sz w:val="24"/>
-          <w:szCs w:val="24"/>
-        </w:rPr>
-        <w:t xml:space="preserve"> </w:t>
+          <w:lang w:val="vi-VN"/>
+        </w:rPr>
+        <w:t>Đ</w:t>
+      </w:r>
+      <w:r>
+        <w:rPr>
+          <w:b/>
+          <w:bCs/>
+          <w:sz w:val="24"/>
+          <w:szCs w:val="24"/>
+          <w:lang w:val="vi-VN"/>
+        </w:rPr>
+        <w:t>ặ</w:t>
       </w:r>
       <w:r>
         <w:rPr>
@@ -1225,56 +1229,42 @@
           <w:bCs/>
           <w:sz w:val="24"/>
           <w:szCs w:val="24"/>
-        </w:rPr>
-        <w:t>Đ</w:t>
-      </w:r>
-      <w:r>
-        <w:rPr>
-          <w:b/>
-          <w:bCs/>
-          <w:sz w:val="24"/>
-          <w:szCs w:val="24"/>
-        </w:rPr>
-        <w:t>ặ</w:t>
-      </w:r>
+          <w:lang w:val="vi-VN"/>
+        </w:rPr>
+        <w:t>t xe</w:t>
+      </w:r>
+    </w:p>
+    <w:p>
+      <w:pPr>
+        <w:rPr>
+          <w:sz w:val="24"/>
+          <w:szCs w:val="24"/>
+          <w:lang w:val="vi-VN"/>
+        </w:rPr>
+      </w:pPr>
       <w:r>
         <w:rPr>
           <w:rFonts w:hint="eastAsia"/>
-          <w:b/>
-          <w:bCs/>
-          <w:sz w:val="24"/>
-          <w:szCs w:val="24"/>
-        </w:rPr>
-        <w:t>t xe</w:t>
-      </w:r>
-    </w:p>
-    <w:p>
-      <w:pPr>
-        <w:rPr>
-          <w:sz w:val="24"/>
-          <w:szCs w:val="24"/>
-        </w:rPr>
-      </w:pPr>
+          <w:sz w:val="24"/>
+          <w:szCs w:val="24"/>
+          <w:lang w:val="vi-VN"/>
+        </w:rPr>
+        <w:t>Sau khi khách hàng b</w:t>
+      </w:r>
+      <w:r>
+        <w:rPr>
+          <w:sz w:val="24"/>
+          <w:szCs w:val="24"/>
+          <w:lang w:val="vi-VN"/>
+        </w:rPr>
+        <w:t>ấ</w:t>
+      </w:r>
       <w:r>
         <w:rPr>
           <w:rFonts w:hint="eastAsia"/>
           <w:sz w:val="24"/>
           <w:szCs w:val="24"/>
-        </w:rPr>
-        <w:t>Sau khi khách hàng b</w:t>
-      </w:r>
-      <w:r>
-        <w:rPr>
-          <w:sz w:val="24"/>
-          <w:szCs w:val="24"/>
-        </w:rPr>
-        <w:t>ấ</w:t>
-      </w:r>
-      <w:r>
-        <w:rPr>
-          <w:rFonts w:hint="eastAsia"/>
-          <w:sz w:val="24"/>
-          <w:szCs w:val="24"/>
+          <w:lang w:val="vi-VN"/>
         </w:rPr>
         <w:t xml:space="preserve">m </w:t>
       </w:r>
@@ -1282,6 +1272,7 @@
         <w:rPr>
           <w:sz w:val="24"/>
           <w:szCs w:val="24"/>
+          <w:lang w:val="vi-VN"/>
         </w:rPr>
         <w:t>“Chọn thuê”, hệ thống sẽ chuyển đến trang checkout.</w:t>
       </w:r>
@@ -1296,12 +1287,14 @@
         <w:rPr>
           <w:sz w:val="24"/>
           <w:szCs w:val="24"/>
-        </w:rPr>
-      </w:pPr>
-      <w:r>
-        <w:rPr>
-          <w:sz w:val="24"/>
-          <w:szCs w:val="24"/>
+          <w:lang w:val="vi-VN"/>
+        </w:rPr>
+      </w:pPr>
+      <w:r>
+        <w:rPr>
+          <w:sz w:val="24"/>
+          <w:szCs w:val="24"/>
+          <w:lang w:val="vi-VN"/>
         </w:rPr>
         <w:t xml:space="preserve">B1: Khách hàng sẽ kiếm tra lại thông tin liên lạc của bản thân, nếu là tài khoản “Guest” khách hàng sẽ phải đăng nhập để thực hiện các bước tiếp theo. Kiểm tra lại thời điểm giao nhận xe, kiểm tra phí thuê xe đã bao gồm các loại phí dịch vụ. Hơn nữa, khách hàng có thể nhập “Lời nhắn cho chủ xe” để sau khi gửi yêu cầu, khách hàng và chủ xe có thể nhắn tin trực tiếp với nhau để bàn thêm về xe. </w:t>
       </w:r>
@@ -1309,6 +1302,7 @@
         <w:rPr>
           <w:sz w:val="24"/>
           <w:szCs w:val="24"/>
+          <w:lang w:val="vi-VN"/>
         </w:rPr>
         <w:t xml:space="preserve">Đối với những khách hàng muốn giao xe đến vị trí của bản thân, họ có thể thấy khoảng cách vị trí xe với vị trí bản thân trên bản đồ, tính tiền dựa trên khoảng cách rõ tường minh. </w:t>
       </w:r>
@@ -1323,12 +1317,14 @@
         <w:rPr>
           <w:sz w:val="24"/>
           <w:szCs w:val="24"/>
-        </w:rPr>
-      </w:pPr>
-      <w:r>
-        <w:rPr>
-          <w:sz w:val="24"/>
-          <w:szCs w:val="24"/>
+          <w:lang w:val="vi-VN"/>
+        </w:rPr>
+      </w:pPr>
+      <w:r>
+        <w:rPr>
+          <w:sz w:val="24"/>
+          <w:szCs w:val="24"/>
+          <w:lang w:val="vi-VN"/>
         </w:rPr>
         <w:t>B2: Khách hàng đến với bước thanh toán, khách hàng cần cọc trước 30% số tiền qua hệ thống.</w:t>
       </w:r>
@@ -1339,28 +1335,24 @@
         <w:rPr>
           <w:sz w:val="24"/>
           <w:szCs w:val="24"/>
-        </w:rPr>
-      </w:pPr>
-      <w:r>
-        <w:rPr>
-          <w:sz w:val="24"/>
-          <w:szCs w:val="24"/>
-        </w:rPr>
-        <w:t xml:space="preserve">Ở đây, hệ thống sử dụng mô hình Tạm giữ tiền (Escrow – Pre-pay) hoạt động như một khoản bảo chứng tài chính. </w:t>
-      </w:r>
-      <w:r>
-        <w:rPr>
-          <w:sz w:val="24"/>
-          <w:szCs w:val="24"/>
-        </w:rPr>
-        <w:t xml:space="preserve">Thay vì trừ thẳng vào tài khoản, hệ thống chỉ </w:t>
-      </w:r>
-      <w:r>
-        <w:rPr>
-          <w:b/>
-          <w:bCs/>
-          <w:sz w:val="24"/>
-          <w:szCs w:val="24"/>
+          <w:lang w:val="vi-VN"/>
+        </w:rPr>
+      </w:pPr>
+      <w:r>
+        <w:rPr>
+          <w:sz w:val="24"/>
+          <w:szCs w:val="24"/>
+          <w:lang w:val="vi-VN"/>
+        </w:rPr>
+        <w:t xml:space="preserve">Ở đây, hệ thống sử dụng mô hình Tạm giữ tiền (Escrow – Pre-pay) hoạt động như một khoản bảo chứng tài chính. Thay vì trừ thẳng vào tài khoản, hệ thống chỉ </w:t>
+      </w:r>
+      <w:r>
+        <w:rPr>
+          <w:b/>
+          <w:bCs/>
+          <w:sz w:val="24"/>
+          <w:szCs w:val="24"/>
+          <w:lang w:val="vi-VN"/>
         </w:rPr>
         <w:t>phong tỏa (hold)</w:t>
       </w:r>
@@ -1368,6 +1360,7 @@
         <w:rPr>
           <w:sz w:val="24"/>
           <w:szCs w:val="24"/>
+          <w:lang w:val="vi-VN"/>
         </w:rPr>
         <w:t xml:space="preserve"> hạn mức thẻ tín dụng của bạn hoặc giữ tiền cọc để đảm bảo bạn sẽ thanh toán đúng hạn và đền bù nếu có phát sinh. </w:t>
       </w:r>
@@ -1378,21 +1371,16 @@
         <w:rPr>
           <w:sz w:val="24"/>
           <w:szCs w:val="24"/>
-        </w:rPr>
-      </w:pPr>
-      <w:r>
-        <w:rPr>
-          <w:sz w:val="24"/>
-          <w:szCs w:val="24"/>
-        </w:rPr>
-        <w:t>(</w:t>
-      </w:r>
-      <w:r>
-        <w:rPr>
-          <w:sz w:val="24"/>
-          <w:szCs w:val="24"/>
-        </w:rPr>
-        <w:t>Quy trình này hoạt động qua các bước rõ ràng sau:</w:t>
+          <w:lang w:val="vi-VN"/>
+        </w:rPr>
+      </w:pPr>
+      <w:r>
+        <w:rPr>
+          <w:sz w:val="24"/>
+          <w:szCs w:val="24"/>
+          <w:lang w:val="vi-VN"/>
+        </w:rPr>
+        <w:t>(Quy trình này hoạt động qua các bước rõ ràng sau:</w:t>
       </w:r>
     </w:p>
     <w:p>
@@ -2135,14 +2123,96 @@
           <w:szCs w:val="24"/>
         </w:rPr>
       </w:pPr>
-    </w:p>
-    <w:p>
-      <w:pPr>
-        <w:rPr>
-          <w:sz w:val="24"/>
-          <w:szCs w:val="24"/>
-        </w:rPr>
-      </w:pPr>
+      <w:r>
+        <w:rPr>
+          <w:sz w:val="24"/>
+          <w:szCs w:val="24"/>
+        </w:rPr>
+        <w:drawing>
+          <wp:inline distT="0" distB="0" distL="0" distR="0" wp14:anchorId="368235A7" wp14:editId="3D301CB8">
+            <wp:extent cx="5943600" cy="1835150"/>
+            <wp:effectExtent l="0" t="0" r="0" b="0"/>
+            <wp:docPr id="789979529" name="Hình ảnh 1"/>
+            <wp:cNvGraphicFramePr>
+              <a:graphicFrameLocks xmlns:a="http://schemas.openxmlformats.org/drawingml/2006/main" noChangeAspect="1"/>
+            </wp:cNvGraphicFramePr>
+            <a:graphic xmlns:a="http://schemas.openxmlformats.org/drawingml/2006/main">
+              <a:graphicData uri="http://schemas.openxmlformats.org/drawingml/2006/picture">
+                <pic:pic xmlns:pic="http://schemas.openxmlformats.org/drawingml/2006/picture">
+                  <pic:nvPicPr>
+                    <pic:cNvPr id="789979529" name=""/>
+                    <pic:cNvPicPr/>
+                  </pic:nvPicPr>
+                  <pic:blipFill>
+                    <a:blip r:embed="rId5"/>
+                    <a:stretch>
+                      <a:fillRect/>
+                    </a:stretch>
+                  </pic:blipFill>
+                  <pic:spPr>
+                    <a:xfrm>
+                      <a:off x="0" y="0"/>
+                      <a:ext cx="5943600" cy="1835150"/>
+                    </a:xfrm>
+                    <a:prstGeom prst="rect">
+                      <a:avLst/>
+                    </a:prstGeom>
+                  </pic:spPr>
+                </pic:pic>
+              </a:graphicData>
+            </a:graphic>
+          </wp:inline>
+        </w:drawing>
+      </w:r>
+    </w:p>
+    <w:p>
+      <w:pPr>
+        <w:rPr>
+          <w:sz w:val="24"/>
+          <w:szCs w:val="24"/>
+        </w:rPr>
+      </w:pPr>
+      <w:r>
+        <w:rPr>
+          <w:sz w:val="24"/>
+          <w:szCs w:val="24"/>
+        </w:rPr>
+        <w:drawing>
+          <wp:inline distT="0" distB="0" distL="0" distR="0" wp14:anchorId="69F3C72D" wp14:editId="06F05E2F">
+            <wp:extent cx="5943600" cy="3437255"/>
+            <wp:effectExtent l="0" t="0" r="0" b="0"/>
+            <wp:docPr id="1922853173" name="Hình ảnh 1"/>
+            <wp:cNvGraphicFramePr>
+              <a:graphicFrameLocks xmlns:a="http://schemas.openxmlformats.org/drawingml/2006/main" noChangeAspect="1"/>
+            </wp:cNvGraphicFramePr>
+            <a:graphic xmlns:a="http://schemas.openxmlformats.org/drawingml/2006/main">
+              <a:graphicData uri="http://schemas.openxmlformats.org/drawingml/2006/picture">
+                <pic:pic xmlns:pic="http://schemas.openxmlformats.org/drawingml/2006/picture">
+                  <pic:nvPicPr>
+                    <pic:cNvPr id="1922853173" name=""/>
+                    <pic:cNvPicPr/>
+                  </pic:nvPicPr>
+                  <pic:blipFill>
+                    <a:blip r:embed="rId6"/>
+                    <a:stretch>
+                      <a:fillRect/>
+                    </a:stretch>
+                  </pic:blipFill>
+                  <pic:spPr>
+                    <a:xfrm>
+                      <a:off x="0" y="0"/>
+                      <a:ext cx="5943600" cy="3437255"/>
+                    </a:xfrm>
+                    <a:prstGeom prst="rect">
+                      <a:avLst/>
+                    </a:prstGeom>
+                  </pic:spPr>
+                </pic:pic>
+              </a:graphicData>
+            </a:graphic>
+          </wp:inline>
+        </w:drawing>
+      </w:r>
     </w:p>
     <w:p>
       <w:pPr>
@@ -3798,6 +3868,7 @@
   <w:style w:type="character" w:default="1" w:styleId="Phngmcinhcuaoanvn">
     <w:name w:val="Default Paragraph Font"/>
     <w:uiPriority w:val="1"/>
+    <w:semiHidden/>
     <w:unhideWhenUsed/>
   </w:style>
   <w:style w:type="table" w:default="1" w:styleId="BangThngthng">

</xml_diff>